<commit_message>
Public pages and downloads render quote chips without dealer figures
The generated site now keeps written-quote existence visible (chips, counts,
dates) while dealer-quoted figures, counters, and gap math stay off the
public pages, the xlsx/docx/pdf downloads, and the calculator seed. Data in
board.json keeps full fidelity for tooling; the redaction happens at render
and at the downloads model handoff. Also adds a python-playwright fallback
for the PDF step on environments without node playwright.

Co-Authored-By: Claude Fable 5 <noreply@anthropic.com>
Claude-Session: https://claude.ai/code/session_01HSSGkNu3Mr9vQrXnxF1MKw
</commit_message>
<xml_diff>
--- a/cx5_report.docx
+++ b/cx5_report.docx
@@ -41,7 +41,7 @@
         <w:pStyle w:val="ListBullet"/>
       </w:pPr>
       <w:r>
-        <w:t>Best remaining, comfort-first: #5 2021 Grand Touring + GT Premium pkg at Kirkland ($25,192 list, $24,992 quoted in writing), then #12 Mazda-CPO 2023 Preferred at Lee Johnson ($26,348) and #13 ventilated-seat 2022 Premium Plus in Olympia ($27,389 list, $31,000 OTD quoted), then the CPO pair: #9 2023 Carbon at Puyallup ($27,699) and #7 2022 Carbon at Lee Johnson ($27,512). #4, the dealer-confirmed Carbon Turbo in Portland at $26,102, is the Oregon fallback (email only). See New candidates below.</w:t>
+        <w:t>Best remaining, comfort-first: #5 2021 Grand Touring + GT Premium pkg at Kirkland ($25,192 list, written itemized quote in hand), then #12 Mazda-CPO 2023 Preferred at Lee Johnson ($26,348) and #13 ventilated-seat 2022 Premium Plus in Olympia ($27,389 list, revised written quote in hand), then the CPO pair: #9 2023 Carbon at Puyallup ($27,699) and #7 2022 Carbon at Lee Johnson ($27,512). #4, the dealer-confirmed Carbon Turbo in Portland at $26,102, is the Oregon fallback (email only). See New candidates below.</w:t>
       </w:r>
     </w:p>
     <w:p>
@@ -49,7 +49,7 @@
         <w:pStyle w:val="ListBullet"/>
       </w:pPr>
       <w:r>
-        <w:t>Cheapest solid vs. stretch: #5 2021 Grand Touring AWD at $28,591 OTD (quoted, $557/mo) vs. #1 2023 2.5 Turbo AWD at $31,823 (est, $620/mo).</w:t>
+        <w:t>Cheapest solid vs. stretch: #5 2021 Grand Touring AWD at $28,713 OTD (est, $559/mo) vs. #1 2023 2.5 Turbo AWD at $31,823 (est, $620/mo).</w:t>
       </w:r>
     </w:p>
     <w:p>
@@ -89,7 +89,7 @@
         <w:pStyle w:val="ListBullet"/>
       </w:pPr>
       <w:r>
-        <w:t>Aug 12, 2026: Rodland (#14) pricing sheet transcribed: $31,957.24 OTD, clean ($0 add-ons, $200 doc; tax + licence lumped).</w:t>
+        <w:t>Aug 12, 2026: Rodland (#14) pricing sheet transcribed: clean sheet, no add-ons; tax and licence lumped in one line, itemization requested.</w:t>
       </w:r>
     </w:p>
     <w:p>
@@ -155,12 +155,12 @@
     </w:p>
     <w:p>
       <w:r>
-        <w:t>$557/mo at $0 down on the written OTD of $28,591 (6.30% · 60 mo).</w:t>
+        <w:t>$559/mo at $0 down on the estimated OTD of $28,713 (6.30% · 60 mo).</w:t>
       </w:r>
     </w:p>
     <w:p>
       <w:r>
-        <w:t>Comfort-per-dollar leader: the GT Premium package (ventilated fronts, heated rears + wheel, HUD) on the non-turbo engine, $3,338 under KBB fair purchase price after 4 cuts and 48 days listed, Carfax clean. The only pick with a clean written sheet: $24,992 selling / $28,591.14 out-the-door, zero add-ons (Aug 11); accept + deposit-hold reply staged.</w:t>
+        <w:t>Comfort-per-dollar leader: the GT Premium package (ventilated fronts, heated rears + wheel, HUD) on the non-turbo 2.5 at the lowest list price of any GT in the set — and the only car with a written itemized quote in hand (zero add-ons, doc at the state cap).</w:t>
       </w:r>
     </w:p>
     <w:p>
@@ -226,7 +226,7 @@
     </w:p>
     <w:p>
       <w:r>
-        <w:t>Runners-up, comfort-first: #12, the Mazda-CPO 2023 Preferred at Lee Johnson ($26,348, in the same written request as #7), and #13, the ventilated-seat 2022 Premium Plus in Olympia ($31,000 OTD quoted, holding at $30,200); #4, the dealer-confirmed Carbon Turbo in Portland ($26,102, quote in preparation), is the Oregon fallback (email only).</w:t>
+        <w:t>Runners-up, comfort-first: #12, the Mazda-CPO 2023 Preferred at Lee Johnson ($26,348, in the same written request as #7), and #13, the ventilated-seat 2022 Premium Plus in Olympia (revised written quote in hand); #4, the dealer-confirmed Carbon Turbo in Portland ($26,102, quote in preparation), is the Oregon fallback (email only).</w:t>
       </w:r>
     </w:p>
     <w:p>
@@ -561,7 +561,7 @@
           </w:tcPr>
           <w:p>
             <w:r>
-              <w:t>quote in preparation (Aug 11, 3:57 PM); Evan's $28,500 OTD counter sent. Oregon: email-only leverage.</w:t>
+              <w:t>quote in preparation (Aug 11, 3:57 PM); our written-number request is with the dealer. Oregon: email-only leverage.</w:t>
             </w:r>
           </w:p>
         </w:tc>
@@ -613,7 +613,7 @@
           </w:tcPr>
           <w:p>
             <w:r>
-              <w:t>$24,992 quoted; listed $25,192</w:t>
+              <w:t>$25,192</w:t>
             </w:r>
           </w:p>
         </w:tc>
@@ -663,7 +663,7 @@
           </w:tcPr>
           <w:p>
             <w:r>
-              <w:t>written quote Aug 11, 4:21 PM: $24,992 selling / $28,591.14 OTD, zero add-ons; accept + deposit-hold reply staged. KBB lists the dealer as “Ford of Kirkland”; same lot.</w:t>
+              <w:t>written itemized quote received Aug 11, 4:21 PM (zero add-ons, doc fee at the state cap); reply prepared. KBB lists the dealer as “Ford of Kirkland”; same lot.</w:t>
             </w:r>
           </w:p>
         </w:tc>
@@ -969,7 +969,7 @@
           </w:tcPr>
           <w:p>
             <w:r>
-              <w:t>written quote received Aug 11 (PDF, figures not yet transcribed; it lists Courtesy Guard + Forever Start add-ons); Evan countered $29,600 OTD. Oregon: email-only.</w:t>
+              <w:t>written quote received Aug 11 as a PDF; it lists Courtesy Guard + Forever Start add-ons and their removal has been requested. Oregon: email-only.</w:t>
             </w:r>
           </w:p>
         </w:tc>
@@ -1327,7 +1327,7 @@
           </w:tcPr>
           <w:p>
             <w:r>
-              <w:t>$27,268.60 quoted; listed $27,389</w:t>
+              <w:t>$27,389</w:t>
             </w:r>
           </w:p>
         </w:tc>
@@ -1377,7 +1377,7 @@
           </w:tcPr>
           <w:p>
             <w:r>
-              <w:t>revised written quote Aug 11, 4:43 PM: $31,000 OTD with the $995 KARR add-on struck (first sheet was $32,229.17); Evan holding at $30,200 OTD.</w:t>
+              <w:t>revised written quote received Aug 11, 4:43 PM with the KARR add-on struck; discussion ongoing.</w:t>
             </w:r>
           </w:p>
         </w:tc>
@@ -1429,7 +1429,7 @@
           </w:tcPr>
           <w:p>
             <w:r>
-              <w:t>$28,287 quoted; listed $28,287 + $200</w:t>
+              <w:t>$28,287 + $200</w:t>
             </w:r>
           </w:p>
         </w:tc>
@@ -1479,7 +1479,7 @@
           </w:tcPr>
           <w:p>
             <w:r>
-              <w:t>written quote Aug 11: $31,957.24 OTD (clean sheet: $28,287 + $200 doc, $0 add-ons, tax + licence lumped at $3,470.24, not itemized); Evan countered $31,100 OTD; next ask is the itemized tax/licence.</w:t>
+              <w:t>written quote received Aug 11 (clean sheet; tax and licence lumped in one line, itemization requested); discussion ongoing.</w:t>
             </w:r>
           </w:p>
         </w:tc>
@@ -1633,7 +1633,7 @@
           </w:tcPr>
           <w:p>
             <w:r>
-              <w:t>$25,400 quoted; listed $25,799</w:t>
+              <w:t>$25,799</w:t>
             </w:r>
           </w:p>
         </w:tc>
@@ -1683,7 +1683,7 @@
           </w:tcPr>
           <w:p>
             <w:r>
-              <w:t>written $28,718.60 OTD ($25,400 selling, $0 doc, no add-ons) valid to Aug 12, 7 PM; Evan's $27,000 + inspection counter was declined.</w:t>
+              <w:t>written offer in hand, valid to Aug 12, 7 PM; Carfax shows a 6/2024 accident. Discussion paused.</w:t>
             </w:r>
           </w:p>
         </w:tc>
@@ -1887,7 +1887,7 @@
           </w:tcPr>
           <w:p>
             <w:r>
-              <w:t>folded into the #8 thread with a $29,400 OTD counter (Aug 11); no separate quote yet. Oregon: email-only.</w:t>
+              <w:t>folded into the #8 thread; no separate quote yet. Oregon: email-only.</w:t>
             </w:r>
           </w:p>
         </w:tc>
@@ -3572,7 +3572,7 @@
           </w:tcPr>
           <w:p>
             <w:r>
-              <w:t>quoted Aug 11</w:t>
+              <w:t>est. 10.80%</w:t>
             </w:r>
           </w:p>
         </w:tc>
@@ -3582,7 +3582,7 @@
           </w:tcPr>
           <w:p>
             <w:r>
-              <w:t>$24,992</w:t>
+              <w:t>$25,192</w:t>
             </w:r>
           </w:p>
         </w:tc>
@@ -3592,7 +3592,7 @@
           </w:tcPr>
           <w:p>
             <w:r>
-              <w:t>$28,591</w:t>
+              <w:t>$28,713</w:t>
             </w:r>
           </w:p>
         </w:tc>
@@ -3602,7 +3602,7 @@
           </w:tcPr>
           <w:p>
             <w:r>
-              <w:t>$557</w:t>
+              <w:t>$559</w:t>
             </w:r>
           </w:p>
         </w:tc>
@@ -3612,7 +3612,7 @@
           </w:tcPr>
           <w:p>
             <w:r>
-              <w:t>$459</w:t>
+              <w:t>$462</w:t>
             </w:r>
           </w:p>
         </w:tc>
@@ -3622,7 +3622,7 @@
           </w:tcPr>
           <w:p>
             <w:r>
-              <w:t>$4,813</w:t>
+              <w:t>$4,834</w:t>
             </w:r>
           </w:p>
         </w:tc>
@@ -3634,7 +3634,7 @@
           </w:tcPr>
           <w:p>
             <w:r>
-              <w:t>#17</w:t>
+              <w:t>#21</w:t>
             </w:r>
           </w:p>
         </w:tc>
@@ -3644,7 +3644,7 @@
           </w:tcPr>
           <w:p>
             <w:r>
-              <w:t>2021 Grand Touring w/ GT Premium pkg · Auto 206</w:t>
+              <w:t>2021 Signature (2.5T) · Cortes Auto Center</w:t>
             </w:r>
           </w:p>
         </w:tc>
@@ -3654,7 +3654,7 @@
           </w:tcPr>
           <w:p>
             <w:r>
-              <w:t>quoted Aug 11</w:t>
+              <w:t>est. 9.10%</w:t>
             </w:r>
           </w:p>
         </w:tc>
@@ -3664,7 +3664,7 @@
           </w:tcPr>
           <w:p>
             <w:r>
-              <w:t>$25,400</w:t>
+              <w:t>$25,999</w:t>
             </w:r>
           </w:p>
         </w:tc>
@@ -3674,7 +3674,7 @@
           </w:tcPr>
           <w:p>
             <w:r>
-              <w:t>$28,719</w:t>
+              <w:t>$29,165</w:t>
             </w:r>
           </w:p>
         </w:tc>
@@ -3684,7 +3684,7 @@
           </w:tcPr>
           <w:p>
             <w:r>
-              <w:t>$559</w:t>
+              <w:t>$568</w:t>
             </w:r>
           </w:p>
         </w:tc>
@@ -3694,7 +3694,7 @@
           </w:tcPr>
           <w:p>
             <w:r>
-              <w:t>$462</w:t>
+              <w:t>$471</w:t>
             </w:r>
           </w:p>
         </w:tc>
@@ -3704,7 +3704,7 @@
           </w:tcPr>
           <w:p>
             <w:r>
-              <w:t>$4,835</w:t>
+              <w:t>$4,910</w:t>
             </w:r>
           </w:p>
         </w:tc>
@@ -3716,7 +3716,7 @@
           </w:tcPr>
           <w:p>
             <w:r>
-              <w:t>#21</w:t>
+              <w:t>#17</w:t>
             </w:r>
           </w:p>
         </w:tc>
@@ -3726,7 +3726,7 @@
           </w:tcPr>
           <w:p>
             <w:r>
-              <w:t>2021 Signature (2.5T) · Cortes Auto Center</w:t>
+              <w:t>2021 Grand Touring w/ GT Premium pkg · Auto 206</w:t>
             </w:r>
           </w:p>
         </w:tc>
@@ -3736,7 +3736,7 @@
           </w:tcPr>
           <w:p>
             <w:r>
-              <w:t>est. 9.10%</w:t>
+              <w:t>est. 10.90%</w:t>
             </w:r>
           </w:p>
         </w:tc>
@@ -3746,7 +3746,7 @@
           </w:tcPr>
           <w:p>
             <w:r>
-              <w:t>$25,999</w:t>
+              <w:t>$25,799</w:t>
             </w:r>
           </w:p>
         </w:tc>
@@ -3756,7 +3756,7 @@
           </w:tcPr>
           <w:p>
             <w:r>
-              <w:t>$29,165</w:t>
+              <w:t>$29,211</w:t>
             </w:r>
           </w:p>
         </w:tc>
@@ -3766,7 +3766,7 @@
           </w:tcPr>
           <w:p>
             <w:r>
-              <w:t>$568</w:t>
+              <w:t>$569</w:t>
             </w:r>
           </w:p>
         </w:tc>
@@ -3786,7 +3786,7 @@
           </w:tcPr>
           <w:p>
             <w:r>
-              <w:t>$4,910</w:t>
+              <w:t>$4,918</w:t>
             </w:r>
           </w:p>
         </w:tc>
@@ -4228,7 +4228,7 @@
           </w:tcPr>
           <w:p>
             <w:r>
-              <w:t>quoted Aug 11</w:t>
+              <w:t>est. 10.20%</w:t>
             </w:r>
           </w:p>
         </w:tc>
@@ -4238,7 +4238,7 @@
           </w:tcPr>
           <w:p>
             <w:r>
-              <w:t>$27,269</w:t>
+              <w:t>$27,389</w:t>
             </w:r>
           </w:p>
         </w:tc>
@@ -4248,7 +4248,7 @@
           </w:tcPr>
           <w:p>
             <w:r>
-              <w:t>$31,000</w:t>
+              <w:t>$30,983</w:t>
             </w:r>
           </w:p>
         </w:tc>
@@ -4258,7 +4258,7 @@
           </w:tcPr>
           <w:p>
             <w:r>
-              <w:t>$604</w:t>
+              <w:t>$603</w:t>
             </w:r>
           </w:p>
         </w:tc>
@@ -4278,7 +4278,7 @@
           </w:tcPr>
           <w:p>
             <w:r>
-              <w:t>$5,219</w:t>
+              <w:t>$5,216</w:t>
             </w:r>
           </w:p>
         </w:tc>
@@ -4638,7 +4638,7 @@
           </w:tcPr>
           <w:p>
             <w:r>
-              <w:t>quoted Aug 11</w:t>
+              <w:t>est. 10.40%</w:t>
             </w:r>
           </w:p>
         </w:tc>
@@ -4658,7 +4658,7 @@
           </w:tcPr>
           <w:p>
             <w:r>
-              <w:t>$31,957</w:t>
+              <w:t>$32,029</w:t>
             </w:r>
           </w:p>
         </w:tc>
@@ -4668,7 +4668,7 @@
           </w:tcPr>
           <w:p>
             <w:r>
-              <w:t>$622</w:t>
+              <w:t>$624</w:t>
             </w:r>
           </w:p>
         </w:tc>
@@ -4678,7 +4678,7 @@
           </w:tcPr>
           <w:p>
             <w:r>
-              <w:t>$525</w:t>
+              <w:t>$526</w:t>
             </w:r>
           </w:p>
         </w:tc>
@@ -4688,7 +4688,7 @@
           </w:tcPr>
           <w:p>
             <w:r>
-              <w:t>$5,380</w:t>
+              <w:t>$5,392</w:t>
             </w:r>
           </w:p>
         </w:tc>
@@ -4809,7 +4809,7 @@
           </w:tcPr>
           <w:p>
             <w:r>
-              <w:t>$24,992</w:t>
+              <w:t>$25,192</w:t>
             </w:r>
           </w:p>
         </w:tc>
@@ -4819,7 +4819,7 @@
           </w:tcPr>
           <w:p>
             <w:r>
-              <w:t>$28,591 (quoted)</w:t>
+              <w:t>$28,713 (est)</w:t>
             </w:r>
           </w:p>
         </w:tc>
@@ -4829,7 +4829,7 @@
           </w:tcPr>
           <w:p>
             <w:r>
-              <w:t>$557</w:t>
+              <w:t>$559</w:t>
             </w:r>
           </w:p>
         </w:tc>
@@ -4839,7 +4839,7 @@
           </w:tcPr>
           <w:p>
             <w:r>
-              <w:t>$459</w:t>
+              <w:t>$462</w:t>
             </w:r>
           </w:p>
         </w:tc>
@@ -4931,7 +4931,7 @@
           </w:tcPr>
           <w:p>
             <w:r>
-              <w:t>+$3,007</w:t>
+              <w:t>+$2,807</w:t>
             </w:r>
           </w:p>
         </w:tc>
@@ -4941,7 +4941,7 @@
           </w:tcPr>
           <w:p>
             <w:r>
-              <w:t>+$3,232</w:t>
+              <w:t>+$3,110</w:t>
             </w:r>
           </w:p>
         </w:tc>
@@ -4951,7 +4951,7 @@
           </w:tcPr>
           <w:p>
             <w:r>
-              <w:t>+$63/mo</w:t>
+              <w:t>+$61/mo</w:t>
             </w:r>
           </w:p>
         </w:tc>
@@ -4961,7 +4961,7 @@
           </w:tcPr>
           <w:p>
             <w:r>
-              <w:t>+$63/mo</w:t>
+              <w:t>+$61/mo</w:t>
             </w:r>
           </w:p>
         </w:tc>
@@ -4970,12 +4970,12 @@
     <w:p/>
     <w:p>
       <w:r>
-        <w:t>Cheapest solid = lowest out-the-door figure (written quote where one exists, else the estimate) among live cars with a verified 1-owner / 0-accident history (or Mazda CPO) at a franchise dealer. Stretch = best-value live 2023 in the Turbo / Premium tiers, ranked by list price against KBB Seattle fair purchase price.</w:t>
+        <w:t>Cheapest solid = lowest estimated out-the-door figure among live cars with a verified 1-owner / 0-accident history (or Mazda CPO) at a franchise dealer. Stretch = best-value live 2023 in the Turbo / Premium tiers, ranked by list price against KBB Seattle fair purchase price.</w:t>
       </w:r>
     </w:p>
     <w:p>
       <w:r>
-        <w:t>Worked example, #5 2021 Grand Touring AWD: $24,992 price → $28,591 out-the-door → $557/mo at $0 down, or $459/mo with $5,000 down (6.30% APR, 60 mo).</w:t>
+        <w:t>Worked example, #5 2021 Grand Touring AWD: $25,192 price → $28,713 out-the-door → $559/mo at $0 down, or $462/mo with $5,000 down (6.30% APR, 60 mo).</w:t>
       </w:r>
     </w:p>
     <w:p>
@@ -5091,466 +5091,6 @@
           <w:p>
             <w:r>
               <w:t>Notes</w:t>
-            </w:r>
-          </w:p>
-        </w:tc>
-      </w:tr>
-      <w:tr>
-        <w:tc>
-          <w:tcPr>
-            <w:tcW w:type="dxa" w:w="960"/>
-          </w:tcPr>
-          <w:p>
-            <w:r>
-              <w:t>#5</w:t>
-            </w:r>
-          </w:p>
-        </w:tc>
-        <w:tc>
-          <w:tcPr>
-            <w:tcW w:type="dxa" w:w="960"/>
-          </w:tcPr>
-          <w:p>
-            <w:r>
-              <w:t>2021 Grand Touring AWD</w:t>
-            </w:r>
-          </w:p>
-        </w:tc>
-        <w:tc>
-          <w:tcPr>
-            <w:tcW w:type="dxa" w:w="960"/>
-          </w:tcPr>
-          <w:p>
-            <w:r>
-              <w:t>Hyundai of Kirkland / Ford of Kirkland</w:t>
-            </w:r>
-          </w:p>
-        </w:tc>
-        <w:tc>
-          <w:tcPr>
-            <w:tcW w:type="dxa" w:w="960"/>
-          </w:tcPr>
-          <w:p>
-            <w:r>
-              <w:t>Aug 11</w:t>
-            </w:r>
-          </w:p>
-        </w:tc>
-        <w:tc>
-          <w:tcPr>
-            <w:tcW w:type="dxa" w:w="960"/>
-          </w:tcPr>
-          <w:p>
-            <w:r>
-              <w:t>$24,992</w:t>
-            </w:r>
-          </w:p>
-        </w:tc>
-        <w:tc>
-          <w:tcPr>
-            <w:tcW w:type="dxa" w:w="960"/>
-          </w:tcPr>
-          <w:p>
-            <w:r>
-              <w:t>$28,591.14</w:t>
-            </w:r>
-          </w:p>
-        </w:tc>
-        <w:tc>
-          <w:tcPr>
-            <w:tcW w:type="dxa" w:w="960"/>
-          </w:tcPr>
-          <w:p>
-            <w:r>
-              <w:t>none</w:t>
-            </w:r>
-          </w:p>
-        </w:tc>
-        <w:tc>
-          <w:tcPr>
-            <w:tcW w:type="dxa" w:w="960"/>
-          </w:tcPr>
-          <w:p>
-            <w:r>
-              <w:t>$27,700</w:t>
-            </w:r>
-          </w:p>
-        </w:tc>
-        <w:tc>
-          <w:tcPr>
-            <w:tcW w:type="dxa" w:w="960"/>
-          </w:tcPr>
-          <w:p>
-            <w:r>
-              <w:t>selling $200 under list; zero add-ons</w:t>
-            </w:r>
-          </w:p>
-        </w:tc>
-      </w:tr>
-      <w:tr>
-        <w:tc>
-          <w:tcPr>
-            <w:tcW w:type="dxa" w:w="960"/>
-          </w:tcPr>
-          <w:p>
-            <w:r>
-              <w:t>#8</w:t>
-            </w:r>
-          </w:p>
-        </w:tc>
-        <w:tc>
-          <w:tcPr>
-            <w:tcW w:type="dxa" w:w="960"/>
-          </w:tcPr>
-          <w:p>
-            <w:r>
-              <w:t>2023 2.5 S Preferred</w:t>
-            </w:r>
-          </w:p>
-        </w:tc>
-        <w:tc>
-          <w:tcPr>
-            <w:tcW w:type="dxa" w:w="960"/>
-          </w:tcPr>
-          <w:p>
-            <w:r>
-              <w:t>Royal Moore Mazda</w:t>
-            </w:r>
-          </w:p>
-        </w:tc>
-        <w:tc>
-          <w:tcPr>
-            <w:tcW w:type="dxa" w:w="960"/>
-          </w:tcPr>
-          <w:p>
-            <w:r>
-              <w:t>Aug 11</w:t>
-            </w:r>
-          </w:p>
-        </w:tc>
-        <w:tc>
-          <w:tcPr>
-            <w:tcW w:type="dxa" w:w="960"/>
-          </w:tcPr>
-          <w:p>
-            <w:r>
-              <w:t>—</w:t>
-            </w:r>
-          </w:p>
-        </w:tc>
-        <w:tc>
-          <w:tcPr>
-            <w:tcW w:type="dxa" w:w="960"/>
-          </w:tcPr>
-          <w:p>
-            <w:r>
-              <w:t>figures pending</w:t>
-            </w:r>
-          </w:p>
-        </w:tc>
-        <w:tc>
-          <w:tcPr>
-            <w:tcW w:type="dxa" w:w="960"/>
-          </w:tcPr>
-          <w:p>
-            <w:r>
-              <w:t>Courtesy Guard, Forever Start</w:t>
-            </w:r>
-          </w:p>
-        </w:tc>
-        <w:tc>
-          <w:tcPr>
-            <w:tcW w:type="dxa" w:w="960"/>
-          </w:tcPr>
-          <w:p>
-            <w:r>
-              <w:t>$29,600</w:t>
-            </w:r>
-          </w:p>
-        </w:tc>
-        <w:tc>
-          <w:tcPr>
-            <w:tcW w:type="dxa" w:w="960"/>
-          </w:tcPr>
-          <w:p>
-            <w:r>
-              <w:t>carries two dealer add-ons to strike</w:t>
-            </w:r>
-          </w:p>
-        </w:tc>
-      </w:tr>
-      <w:tr>
-        <w:tc>
-          <w:tcPr>
-            <w:tcW w:type="dxa" w:w="960"/>
-          </w:tcPr>
-          <w:p>
-            <w:r>
-              <w:t>#13</w:t>
-            </w:r>
-          </w:p>
-        </w:tc>
-        <w:tc>
-          <w:tcPr>
-            <w:tcW w:type="dxa" w:w="960"/>
-          </w:tcPr>
-          <w:p>
-            <w:r>
-              <w:t>2022 2.5 S Premium Plus</w:t>
-            </w:r>
-          </w:p>
-        </w:tc>
-        <w:tc>
-          <w:tcPr>
-            <w:tcW w:type="dxa" w:w="960"/>
-          </w:tcPr>
-          <w:p>
-            <w:r>
-              <w:t>Titus-Will Chevrolet GMC Cadillac</w:t>
-            </w:r>
-          </w:p>
-        </w:tc>
-        <w:tc>
-          <w:tcPr>
-            <w:tcW w:type="dxa" w:w="960"/>
-          </w:tcPr>
-          <w:p>
-            <w:r>
-              <w:t>Aug 11</w:t>
-            </w:r>
-          </w:p>
-        </w:tc>
-        <w:tc>
-          <w:tcPr>
-            <w:tcW w:type="dxa" w:w="960"/>
-          </w:tcPr>
-          <w:p>
-            <w:r>
-              <w:t>$27,268.60</w:t>
-            </w:r>
-          </w:p>
-        </w:tc>
-        <w:tc>
-          <w:tcPr>
-            <w:tcW w:type="dxa" w:w="960"/>
-          </w:tcPr>
-          <w:p>
-            <w:r>
-              <w:t>$31,000</w:t>
-            </w:r>
-          </w:p>
-        </w:tc>
-        <w:tc>
-          <w:tcPr>
-            <w:tcW w:type="dxa" w:w="960"/>
-          </w:tcPr>
-          <w:p>
-            <w:r>
-              <w:t>none</w:t>
-            </w:r>
-          </w:p>
-        </w:tc>
-        <w:tc>
-          <w:tcPr>
-            <w:tcW w:type="dxa" w:w="960"/>
-          </w:tcPr>
-          <w:p>
-            <w:r>
-              <w:t>$30,200</w:t>
-            </w:r>
-          </w:p>
-        </w:tc>
-        <w:tc>
-          <w:tcPr>
-            <w:tcW w:type="dxa" w:w="960"/>
-          </w:tcPr>
-          <w:p>
-            <w:r>
-              <w:t>$995 KARR add-on struck on the revision; $750 government fees to be trued up at actuals</w:t>
-            </w:r>
-          </w:p>
-        </w:tc>
-      </w:tr>
-      <w:tr>
-        <w:tc>
-          <w:tcPr>
-            <w:tcW w:type="dxa" w:w="960"/>
-          </w:tcPr>
-          <w:p>
-            <w:r>
-              <w:t>#14</w:t>
-            </w:r>
-          </w:p>
-        </w:tc>
-        <w:tc>
-          <w:tcPr>
-            <w:tcW w:type="dxa" w:w="960"/>
-          </w:tcPr>
-          <w:p>
-            <w:r>
-              <w:t>2023 2.5 S Premium</w:t>
-            </w:r>
-          </w:p>
-        </w:tc>
-        <w:tc>
-          <w:tcPr>
-            <w:tcW w:type="dxa" w:w="960"/>
-          </w:tcPr>
-          <w:p>
-            <w:r>
-              <w:t>Rodland Toyota of Everett</w:t>
-            </w:r>
-          </w:p>
-        </w:tc>
-        <w:tc>
-          <w:tcPr>
-            <w:tcW w:type="dxa" w:w="960"/>
-          </w:tcPr>
-          <w:p>
-            <w:r>
-              <w:t>Aug 11</w:t>
-            </w:r>
-          </w:p>
-        </w:tc>
-        <w:tc>
-          <w:tcPr>
-            <w:tcW w:type="dxa" w:w="960"/>
-          </w:tcPr>
-          <w:p>
-            <w:r>
-              <w:t>$28,487</w:t>
-            </w:r>
-          </w:p>
-        </w:tc>
-        <w:tc>
-          <w:tcPr>
-            <w:tcW w:type="dxa" w:w="960"/>
-          </w:tcPr>
-          <w:p>
-            <w:r>
-              <w:t>$31,957.24</w:t>
-            </w:r>
-          </w:p>
-        </w:tc>
-        <w:tc>
-          <w:tcPr>
-            <w:tcW w:type="dxa" w:w="960"/>
-          </w:tcPr>
-          <w:p>
-            <w:r>
-              <w:t>none</w:t>
-            </w:r>
-          </w:p>
-        </w:tc>
-        <w:tc>
-          <w:tcPr>
-            <w:tcW w:type="dxa" w:w="960"/>
-          </w:tcPr>
-          <w:p>
-            <w:r>
-              <w:t>$31,100</w:t>
-            </w:r>
-          </w:p>
-        </w:tc>
-        <w:tc>
-          <w:tcPr>
-            <w:tcW w:type="dxa" w:w="960"/>
-          </w:tcPr>
-          <w:p>
-            <w:r>
-              <w:t>tax + licence lumped, consistent with Everett 10.40% plus ~$508 of title/licence; ask for the itemized rate and licence</w:t>
-            </w:r>
-          </w:p>
-        </w:tc>
-      </w:tr>
-      <w:tr>
-        <w:tc>
-          <w:tcPr>
-            <w:tcW w:type="dxa" w:w="960"/>
-          </w:tcPr>
-          <w:p>
-            <w:r>
-              <w:t>#17</w:t>
-            </w:r>
-          </w:p>
-        </w:tc>
-        <w:tc>
-          <w:tcPr>
-            <w:tcW w:type="dxa" w:w="960"/>
-          </w:tcPr>
-          <w:p>
-            <w:r>
-              <w:t>2021 Grand Touring w/ GT Premium pkg</w:t>
-            </w:r>
-          </w:p>
-        </w:tc>
-        <w:tc>
-          <w:tcPr>
-            <w:tcW w:type="dxa" w:w="960"/>
-          </w:tcPr>
-          <w:p>
-            <w:r>
-              <w:t>Auto 206 (independent)</w:t>
-            </w:r>
-          </w:p>
-        </w:tc>
-        <w:tc>
-          <w:tcPr>
-            <w:tcW w:type="dxa" w:w="960"/>
-          </w:tcPr>
-          <w:p>
-            <w:r>
-              <w:t>Aug 11</w:t>
-            </w:r>
-          </w:p>
-        </w:tc>
-        <w:tc>
-          <w:tcPr>
-            <w:tcW w:type="dxa" w:w="960"/>
-          </w:tcPr>
-          <w:p>
-            <w:r>
-              <w:t>$25,400</w:t>
-            </w:r>
-          </w:p>
-        </w:tc>
-        <w:tc>
-          <w:tcPr>
-            <w:tcW w:type="dxa" w:w="960"/>
-          </w:tcPr>
-          <w:p>
-            <w:r>
-              <w:t>$28,718.60</w:t>
-            </w:r>
-          </w:p>
-        </w:tc>
-        <w:tc>
-          <w:tcPr>
-            <w:tcW w:type="dxa" w:w="960"/>
-          </w:tcPr>
-          <w:p>
-            <w:r>
-              <w:t>none</w:t>
-            </w:r>
-          </w:p>
-        </w:tc>
-        <w:tc>
-          <w:tcPr>
-            <w:tcW w:type="dxa" w:w="960"/>
-          </w:tcPr>
-          <w:p>
-            <w:r>
-              <w:t>$27,000</w:t>
-            </w:r>
-          </w:p>
-        </w:tc>
-        <w:tc>
-          <w:tcPr>
-            <w:tcW w:type="dxa" w:w="960"/>
-          </w:tcPr>
-          <w:p>
-            <w:r>
-              <w:t>cleanest fee sheet seen: no doc fee, no add-ons; disqualified by the Carfax accident unless the rule is waived</w:t>
             </w:r>
           </w:p>
         </w:tc>

</xml_diff>

<commit_message>
Board: Lee Johnson inquiry emails bounced; status reflects undelivered requests
Co-Authored-By: Claude Fable 5 <noreply@anthropic.com>
Claude-Session: https://claude.ai/code/session_01HSSGkNu3Mr9vQrXnxF1MKw
</commit_message>
<xml_diff>
--- a/cx5_report.docx
+++ b/cx5_report.docx
@@ -33,7 +33,7 @@
         <w:pStyle w:val="ListBullet"/>
       </w:pPr>
       <w:r>
-        <w:t>Update Aug 12: Fresh read-only sweep (AutoTempest, CarGurus, KBB, CarMax, Carvana, Craigslist: 386 raw / 223 VINs). Every live board car re-verified with no listed-price change; #12 (Cars.com-only) could not be re-checked from the sweep environment.</w:t>
+        <w:t>Update Aug 12: Lee Johnson (#7, #12): both inquiry emails bounced back undelivered (dealer mail server unreachable); a new contact path is being arranged.</w:t>
       </w:r>
     </w:p>
     <w:p>
@@ -66,6 +66,14 @@
       </w:pPr>
       <w:r>
         <w:t>What changed</w:t>
+      </w:r>
+    </w:p>
+    <w:p>
+      <w:pPr>
+        <w:pStyle w:val="ListBullet"/>
+      </w:pPr>
+      <w:r>
+        <w:t>Aug 12, 2026: Lee Johnson (#7, #12): both inquiry emails bounced back undelivered (dealer mail server unreachable); a new contact path is being arranged.</w:t>
       </w:r>
     </w:p>
     <w:p>
@@ -875,7 +883,7 @@
           </w:tcPr>
           <w:p>
             <w:r>
-              <w:t>two-car OTD request (#7 + #12) emailed Aug 11, 3:50 PM; no reply yet.</w:t>
+              <w:t>two-car OTD request emailed Aug 11 — both emails to the dealer's listed sales address bounced back Aug 12 (server unreachable after 24h of retries) — the request never arrived; a new contact path is being arranged.</w:t>
             </w:r>
           </w:p>
         </w:tc>
@@ -1283,7 +1291,7 @@
           </w:tcPr>
           <w:p>
             <w:r>
-              <w:t>in the Lee Johnson two-car OTD request emailed Aug 11, 3:50 PM; no reply yet.</w:t>
+              <w:t>in the Lee Johnson two-car OTD request (Aug 11) — both emails to the dealer's listed sales address bounced back Aug 12 (server unreachable after 24h of retries) — the request never arrived; a new contact path is being arranged.</w:t>
             </w:r>
           </w:p>
         </w:tc>

</xml_diff>

<commit_message>
Board: Puyallup written quotes in hand for two cars; third requested
Co-Authored-By: Claude Fable 5 <noreply@anthropic.com>
Claude-Session: https://claude.ai/code/session_01HSSGkNu3Mr9vQrXnxF1MKw
</commit_message>
<xml_diff>
--- a/cx5_report.docx
+++ b/cx5_report.docx
@@ -17,7 +17,7 @@
     </w:p>
     <w:p>
       <w:r>
-        <w:t>Published Aug 7, 2026 · refreshed Aug 12, 2026: 16 cars in play, 5 sold, 5 written quotes in hand. This document, the web page, the status board and the Excel workbook are generated together from one board file; listings change daily, so verify before contacting.</w:t>
+        <w:t>Published Aug 7, 2026 · refreshed Aug 12, 2026: 16 cars in play, 5 sold, 7 written quotes in hand. This document, the web page, the status board and the Excel workbook are generated together from one board file; listings change daily, so verify before contacting.</w:t>
       </w:r>
     </w:p>
     <w:p>
@@ -33,7 +33,7 @@
         <w:pStyle w:val="ListBullet"/>
       </w:pPr>
       <w:r>
-        <w:t>Update Aug 12: Lee Johnson (#7, #12): both inquiry emails bounced back undelivered (dealer mail server unreachable); a new contact path is being arranged.</w:t>
+        <w:t>Update Aug 12: Puyallup Mazda (#1, #6): written itemized quotes surfaced (sheets dated Aug 11 had landed in spam); zero add-ons on both. #9's breakdown requested.</w:t>
       </w:r>
     </w:p>
     <w:p>
@@ -66,6 +66,14 @@
       </w:pPr>
       <w:r>
         <w:t>What changed</w:t>
+      </w:r>
+    </w:p>
+    <w:p>
+      <w:pPr>
+        <w:pStyle w:val="ListBullet"/>
+      </w:pPr>
+      <w:r>
+        <w:t>Aug 12, 2026: Puyallup Mazda (#1, #6): written itemized quotes surfaced (sheets dated Aug 11 had landed in spam); zero add-ons on both. #9's breakdown requested.</w:t>
       </w:r>
     </w:p>
     <w:p>
@@ -475,7 +483,7 @@
           </w:tcPr>
           <w:p>
             <w:r>
-              <w:t>awaiting written OTD; form lead Aug 11 plus a phone promise, nothing received.</w:t>
+              <w:t>written itemized quote in hand (sheet dated Aug 11, surfaced Aug 12 after a phone call; the sender's group domain had gone to spam); zero add-ons.</w:t>
             </w:r>
           </w:p>
         </w:tc>
@@ -781,7 +789,7 @@
           </w:tcPr>
           <w:p>
             <w:r>
-              <w:t>awaiting written OTD; same Puyallup lead as #1 (Aug 11), phone promise only.</w:t>
+              <w:t>written itemized quote in hand (sheet dated Aug 11, surfaced Aug 12); zero add-ons.</w:t>
             </w:r>
           </w:p>
         </w:tc>

</xml_diff>

<commit_message>
Board: Kirkland sends an updated written proposal; terms confirmations noted
Co-Authored-By: Claude Fable 5 <noreply@anthropic.com>
Claude-Session: https://claude.ai/code/session_01HSSGkNu3Mr9vQrXnxF1MKw
</commit_message>
<xml_diff>
--- a/cx5_report.docx
+++ b/cx5_report.docx
@@ -17,7 +17,7 @@
     </w:p>
     <w:p>
       <w:r>
-        <w:t>Published Aug 7, 2026 · refreshed Aug 12, 2026: 16 cars in play, 5 sold, 7 written quotes in hand. This document, the web page, the status board and the Excel workbook are generated together from one board file; listings change daily, so verify before contacting.</w:t>
+        <w:t>Published Aug 7, 2026 · refreshed Aug 13, 2026: 16 cars in play, 5 sold, 7 written quotes in hand. This document, the web page, the status board and the Excel workbook are generated together from one board file; listings change daily, so verify before contacting.</w:t>
       </w:r>
     </w:p>
     <w:p>
@@ -33,7 +33,7 @@
         <w:pStyle w:val="ListBullet"/>
       </w:pPr>
       <w:r>
-        <w:t>Update Aug 12: Puyallup Mazda (#1, #6): written itemized quotes surfaced (sheets dated Aug 11 had landed in spam); zero add-ons on both. #9's breakdown requested.</w:t>
+        <w:t>Update Aug 13: Hyundai of Kirkland: updated written proposal received midday; license-at-actuals refund and two keys confirmed in writing; window sticker check in progress.</w:t>
       </w:r>
     </w:p>
     <w:p>
@@ -66,6 +66,14 @@
       </w:pPr>
       <w:r>
         <w:t>What changed</w:t>
+      </w:r>
+    </w:p>
+    <w:p>
+      <w:pPr>
+        <w:pStyle w:val="ListBullet"/>
+      </w:pPr>
+      <w:r>
+        <w:t>Aug 13, 2026: Hyundai of Kirkland: updated written proposal received midday; license-at-actuals refund and two keys confirmed in writing; window sticker check in progress.</w:t>
       </w:r>
     </w:p>
     <w:p>
@@ -161,7 +169,7 @@
         <w:pStyle w:val="Heading1"/>
       </w:pPr>
       <w:r>
-        <w:t>Top 3 right now (Aug 12)</w:t>
+        <w:t>Top 3 right now (Aug 13)</w:t>
       </w:r>
     </w:p>
     <w:p>
@@ -212,7 +220,7 @@
     </w:p>
     <w:p>
       <w:r>
-        <w:t>Biggest FPP gap in the entire dataset ($2,781 under), 1-owner, 89 days on lot → strongest negotiating leverage. Dealer's own site shows $27,999; still no written OTD as of Aug 12 (form lead + phone promise Aug 11).</w:t>
+        <w:t>Biggest FPP gap in the entire dataset ($2,781 under), 1-owner, 89 days on lot → strongest negotiating leverage. Dealer's own site shows $27,999; still no written OTD as of Aug 13 (form lead + phone promise Aug 11).</w:t>
       </w:r>
     </w:p>
     <w:p>
@@ -687,7 +695,7 @@
           </w:tcPr>
           <w:p>
             <w:r>
-              <w:t>written itemized quote received Aug 11, 4:21 PM (zero add-ons, doc fee at the state cap); reply prepared. KBB lists the dealer as “Ford of Kirkland”; same lot.</w:t>
+              <w:t>updated written proposal received Thu Aug 13 midday; license billed at actuals with any overage refunded and two keys confirmed in writing; window sticker being pulled to confirm the GT Premium package.</w:t>
             </w:r>
           </w:p>
         </w:tc>
@@ -2040,7 +2048,7 @@
     </w:p>
     <w:p>
       <w:r>
-        <w:t>Not numbered board cars and not in the top picks, cost table or chart; re-priced on each sweep (prices as of Aug 12).</w:t>
+        <w:t>Not numbered board cars and not in the top picks, cost table or chart; re-priced on each sweep (prices as of Aug 13).</w:t>
       </w:r>
     </w:p>
     <w:p>
@@ -2096,7 +2104,7 @@
           </w:tcPr>
           <w:p>
             <w:r>
-              <w:t>Price Aug 12</w:t>
+              <w:t>Price Aug 13</w:t>
             </w:r>
           </w:p>
         </w:tc>
@@ -3036,7 +3044,7 @@
           </w:tcPr>
           <w:p>
             <w:r>
-              <w:t>Lowest clean listing (Aug 12)</w:t>
+              <w:t>Lowest clean listing (Aug 13)</w:t>
             </w:r>
           </w:p>
         </w:tc>
@@ -7152,7 +7160,7 @@
     </w:p>
     <w:p>
       <w:r>
-        <w:t>Research compiled Aug 7, 2026 as a read-only scan; buyer outreach to dealers began Aug 11 and listings were last re-checked Aug 12, 2026. Not affiliated with any seller. Verify history reports and pricing independently before purchase.</w:t>
+        <w:t>Research compiled Aug 7, 2026 as a read-only scan; buyer outreach to dealers began Aug 11 and listings were last re-checked Aug 13, 2026. Not affiliated with any seller. Verify history reports and pricing independently before purchase.</w:t>
       </w:r>
     </w:p>
     <w:sectPr>

</xml_diff>

<commit_message>
Board: Puyallup CPO breakdown received; Royal Moore manager follow-up noted
Co-Authored-By: Claude Fable 5 <noreply@anthropic.com>
Claude-Session: https://claude.ai/code/session_01HSSGkNu3Mr9vQrXnxF1MKw
</commit_message>
<xml_diff>
--- a/cx5_report.docx
+++ b/cx5_report.docx
@@ -33,7 +33,7 @@
         <w:pStyle w:val="ListBullet"/>
       </w:pPr>
       <w:r>
-        <w:t>Update Aug 13: Hyundai of Kirkland: updated written proposal received midday; license-at-actuals refund and two keys confirmed in writing; window sticker check in progress.</w:t>
+        <w:t>Update Aug 13: Puyallup Mazda: pricing breakdown received for the CPO 2023 Carbon (#9); worksheet attached in email.</w:t>
       </w:r>
     </w:p>
     <w:p>
@@ -66,6 +66,22 @@
       </w:pPr>
       <w:r>
         <w:t>What changed</w:t>
+      </w:r>
+    </w:p>
+    <w:p>
+      <w:pPr>
+        <w:pStyle w:val="ListBullet"/>
+      </w:pPr>
+      <w:r>
+        <w:t>Aug 13, 2026: Puyallup Mazda: pricing breakdown received for the CPO 2023 Carbon (#9); worksheet attached in email.</w:t>
+      </w:r>
+    </w:p>
+    <w:p>
+      <w:pPr>
+        <w:pStyle w:val="ListBullet"/>
+      </w:pPr>
+      <w:r>
+        <w:t>Aug 13, 2026: Royal Moore: manager follow-up received Thu afternoon; reply prepared.</w:t>
       </w:r>
     </w:p>
     <w:p>
@@ -1001,7 +1017,7 @@
           </w:tcPr>
           <w:p>
             <w:r>
-              <w:t>written quote received Aug 11 as a PDF; it lists Courtesy Guard + Forever Start add-ons and their removal has been requested. Oregon: email-only.</w:t>
+              <w:t>a sales manager followed up Thu afternoon; reply prepared.</w:t>
             </w:r>
           </w:p>
         </w:tc>
@@ -1103,7 +1119,7 @@
           </w:tcPr>
           <w:p>
             <w:r>
-              <w:t>folded into the Puyallup #1/#6 inquiry; no written numbers yet.</w:t>
+              <w:t>CPO pricing breakdown received Thu Aug 13 early afternoon; itemized worksheet attached in the dealer's email.</w:t>
             </w:r>
           </w:p>
         </w:tc>

</xml_diff>

<commit_message>
Board: reply stamps for Kirkland and Royal Moore
Co-Authored-By: Claude Fable 5 <noreply@anthropic.com>
Claude-Session: https://claude.ai/code/session_01HSSGkNu3Mr9vQrXnxF1MKw
</commit_message>
<xml_diff>
--- a/cx5_report.docx
+++ b/cx5_report.docx
@@ -711,7 +711,7 @@
           </w:tcPr>
           <w:p>
             <w:r>
-              <w:t>updated written proposal received Thu Aug 13 midday; license billed at actuals with any overage refunded and two keys confirmed in writing; window sticker being pulled to confirm the GT Premium package.</w:t>
+              <w:t>updated written proposal received Thu Aug 13 midday; license billed at actuals with any overage refunded and two keys confirmed in writing; window sticker being pulled to confirm the GT Premium package; replied Thu afternoon.</w:t>
             </w:r>
           </w:p>
         </w:tc>
@@ -1017,7 +1017,7 @@
           </w:tcPr>
           <w:p>
             <w:r>
-              <w:t>a sales manager followed up Thu afternoon; reply prepared.</w:t>
+              <w:t>a sales manager followed up Thu afternoon; replied Thu afternoon.</w:t>
             </w:r>
           </w:p>
         </w:tc>

</xml_diff>

<commit_message>
Board: Royal Moore reports one Preferred sold; the other requoted with add-ons removed
Co-Authored-By: Claude Fable 5 <noreply@anthropic.com>
Claude-Session: https://claude.ai/code/session_01HSSGkNu3Mr9vQrXnxF1MKw
</commit_message>
<xml_diff>
--- a/cx5_report.docx
+++ b/cx5_report.docx
@@ -17,7 +17,7 @@
     </w:p>
     <w:p>
       <w:r>
-        <w:t>Published Aug 7, 2026 · refreshed Aug 13, 2026: 16 cars in play, 5 sold, 7 written quotes in hand. This document, the web page, the status board and the Excel workbook are generated together from one board file; listings change daily, so verify before contacting.</w:t>
+        <w:t>Published Aug 7, 2026 · refreshed Aug 13, 2026: 15 cars in play, 6 sold, 6 written quotes in hand. This document, the web page, the status board and the Excel workbook are generated together from one board file; listings change daily, so verify before contacting.</w:t>
       </w:r>
     </w:p>
     <w:p>
@@ -33,7 +33,7 @@
         <w:pStyle w:val="ListBullet"/>
       </w:pPr>
       <w:r>
-        <w:t>Update Aug 13: Puyallup Mazda: pricing breakdown received for the CPO 2023 Carbon (#9); worksheet attached in email.</w:t>
+        <w:t>Update Aug 13: Royal Moore: one 2023 Preferred sold per the dealer; the remaining one was requoted with the dealer-added items removed.</w:t>
       </w:r>
     </w:p>
     <w:p>
@@ -66,6 +66,14 @@
       </w:pPr>
       <w:r>
         <w:t>What changed</w:t>
+      </w:r>
+    </w:p>
+    <w:p>
+      <w:pPr>
+        <w:pStyle w:val="ListBullet"/>
+      </w:pPr>
+      <w:r>
+        <w:t>Aug 13, 2026: Royal Moore: one 2023 Preferred sold per the dealer; the remaining one was requoted with the dealer-added items removed.</w:t>
       </w:r>
     </w:p>
     <w:p>
@@ -282,7 +290,7 @@
         <w:pStyle w:val="Heading1"/>
       </w:pPr>
       <w:r>
-        <w:t>Shortlist and new candidates: 16 cars in play</w:t>
+        <w:t>Shortlist and new candidates: 15 cars in play</w:t>
       </w:r>
     </w:p>
     <w:p>
@@ -927,7 +935,7 @@
           </w:tcPr>
           <w:p>
             <w:r>
-              <w:t>#8</w:t>
+              <w:t>#9</w:t>
             </w:r>
           </w:p>
         </w:tc>
@@ -947,7 +955,7 @@
           </w:tcPr>
           <w:p>
             <w:r>
-              <w:t>2.5 S Preferred</w:t>
+              <w:t>2.5 S Carbon Edition</w:t>
             </w:r>
           </w:p>
         </w:tc>
@@ -957,7 +965,7 @@
           </w:tcPr>
           <w:p>
             <w:r>
-              <w:t>16,615</w:t>
+              <w:t>33,006</w:t>
             </w:r>
           </w:p>
         </w:tc>
@@ -967,7 +975,7 @@
           </w:tcPr>
           <w:p>
             <w:r>
-              <w:t>$26,900</w:t>
+              <w:t>$27,699</w:t>
             </w:r>
           </w:p>
         </w:tc>
@@ -977,7 +985,7 @@
           </w:tcPr>
           <w:p>
             <w:r>
-              <w:t>Royal Moore Mazda, Hillsboro, OR</w:t>
+              <w:t>Puyallup Mazda, Puyallup, WA</w:t>
             </w:r>
           </w:p>
         </w:tc>
@@ -987,7 +995,7 @@
           </w:tcPr>
           <w:p>
             <w:r>
-              <w:t>Good $469 below</w:t>
+              <w:t>Good $518 below</w:t>
             </w:r>
           </w:p>
         </w:tc>
@@ -997,7 +1005,7 @@
           </w:tcPr>
           <w:p>
             <w:r>
-              <w:t>1-own / 0</w:t>
+              <w:t>1-own / 0 · CPO</w:t>
             </w:r>
           </w:p>
         </w:tc>
@@ -1007,7 +1015,7 @@
           </w:tcPr>
           <w:p>
             <w:r>
-              <w:t>15 d</w:t>
+              <w:t>58 d</w:t>
             </w:r>
           </w:p>
         </w:tc>
@@ -1017,7 +1025,7 @@
           </w:tcPr>
           <w:p>
             <w:r>
-              <w:t>a sales manager followed up Thu afternoon; replied Thu afternoon.</w:t>
+              <w:t>CPO pricing breakdown received Thu Aug 13 early afternoon; itemized worksheet attached in the dealer's email.</w:t>
             </w:r>
           </w:p>
         </w:tc>
@@ -1029,7 +1037,7 @@
           </w:tcPr>
           <w:p>
             <w:r>
-              <w:t>#9</w:t>
+              <w:t>#10</w:t>
             </w:r>
           </w:p>
         </w:tc>
@@ -1049,7 +1057,7 @@
           </w:tcPr>
           <w:p>
             <w:r>
-              <w:t>2.5 S Carbon Edition</w:t>
+              <w:t>2.5 S Preferred</w:t>
             </w:r>
           </w:p>
         </w:tc>
@@ -1059,7 +1067,7 @@
           </w:tcPr>
           <w:p>
             <w:r>
-              <w:t>33,006</w:t>
+              <w:t>44,989</w:t>
             </w:r>
           </w:p>
         </w:tc>
@@ -1069,7 +1077,7 @@
           </w:tcPr>
           <w:p>
             <w:r>
-              <w:t>$27,699</w:t>
+              <w:t>$24,095</w:t>
             </w:r>
           </w:p>
         </w:tc>
@@ -1079,7 +1087,7 @@
           </w:tcPr>
           <w:p>
             <w:r>
-              <w:t>Puyallup Mazda, Puyallup, WA</w:t>
+              <w:t>Columbia Sales &amp; Service, Portland, OR</w:t>
             </w:r>
           </w:p>
         </w:tc>
@@ -1089,7 +1097,7 @@
           </w:tcPr>
           <w:p>
             <w:r>
-              <w:t>Good $518 below</w:t>
+              <w:t>Great Cars.com rating</w:t>
             </w:r>
           </w:p>
         </w:tc>
@@ -1099,7 +1107,7 @@
           </w:tcPr>
           <w:p>
             <w:r>
-              <w:t>1-own / 0 · CPO</w:t>
+              <w:t>2-own / 0</w:t>
             </w:r>
           </w:p>
         </w:tc>
@@ -1109,7 +1117,7 @@
           </w:tcPr>
           <w:p>
             <w:r>
-              <w:t>58 d</w:t>
+              <w:t>29 d</w:t>
             </w:r>
           </w:p>
         </w:tc>
@@ -1119,7 +1127,7 @@
           </w:tcPr>
           <w:p>
             <w:r>
-              <w:t>CPO pricing breakdown received Thu Aug 13 early afternoon; itemized worksheet attached in the dealer's email.</w:t>
+              <w:t>emailed Aug 11, no reply. Oregon: email-only.</w:t>
             </w:r>
           </w:p>
         </w:tc>
@@ -1131,7 +1139,7 @@
           </w:tcPr>
           <w:p>
             <w:r>
-              <w:t>#10</w:t>
+              <w:t>#12</w:t>
             </w:r>
           </w:p>
         </w:tc>
@@ -1151,7 +1159,7 @@
           </w:tcPr>
           <w:p>
             <w:r>
-              <w:t>2.5 S Preferred</w:t>
+              <w:t>2.5 S Preferred · Mazda CPO</w:t>
             </w:r>
           </w:p>
         </w:tc>
@@ -1161,7 +1169,7 @@
           </w:tcPr>
           <w:p>
             <w:r>
-              <w:t>44,989</w:t>
+              <w:t>36,400</w:t>
             </w:r>
           </w:p>
         </w:tc>
@@ -1171,7 +1179,7 @@
           </w:tcPr>
           <w:p>
             <w:r>
-              <w:t>$24,095</w:t>
+              <w:t>$26,348</w:t>
             </w:r>
           </w:p>
         </w:tc>
@@ -1181,7 +1189,7 @@
           </w:tcPr>
           <w:p>
             <w:r>
-              <w:t>Columbia Sales &amp; Service, Portland, OR</w:t>
+              <w:t>Lee Johnson Mazda, Seattle, WA</w:t>
             </w:r>
           </w:p>
         </w:tc>
@@ -1191,7 +1199,7 @@
           </w:tcPr>
           <w:p>
             <w:r>
-              <w:t>Great Cars.com rating</w:t>
+              <w:t>—</w:t>
             </w:r>
           </w:p>
         </w:tc>
@@ -1201,7 +1209,7 @@
           </w:tcPr>
           <w:p>
             <w:r>
-              <w:t>2-own / 0</w:t>
+              <w:t>?-own / 0 · CPO</w:t>
             </w:r>
           </w:p>
         </w:tc>
@@ -1211,7 +1219,7 @@
           </w:tcPr>
           <w:p>
             <w:r>
-              <w:t>29 d</w:t>
+              <w:t>None d</w:t>
             </w:r>
           </w:p>
         </w:tc>
@@ -1221,7 +1229,7 @@
           </w:tcPr>
           <w:p>
             <w:r>
-              <w:t>emailed Aug 11, no reply. Oregon: email-only.</w:t>
+              <w:t>in the Lee Johnson two-car OTD request (Aug 11) — both emails to the dealer's listed sales address bounced back Aug 12 (server unreachable after 24h of retries) — the request never arrived; a new contact path is being arranged.</w:t>
             </w:r>
           </w:p>
         </w:tc>
@@ -1233,7 +1241,7 @@
           </w:tcPr>
           <w:p>
             <w:r>
-              <w:t>#12</w:t>
+              <w:t>#13</w:t>
             </w:r>
           </w:p>
         </w:tc>
@@ -1243,7 +1251,7 @@
           </w:tcPr>
           <w:p>
             <w:r>
-              <w:t>2023</w:t>
+              <w:t>2022</w:t>
             </w:r>
           </w:p>
         </w:tc>
@@ -1253,7 +1261,7 @@
           </w:tcPr>
           <w:p>
             <w:r>
-              <w:t>2.5 S Preferred · Mazda CPO</w:t>
+              <w:t>2.5 S Premium Plus</w:t>
             </w:r>
           </w:p>
         </w:tc>
@@ -1263,7 +1271,7 @@
           </w:tcPr>
           <w:p>
             <w:r>
-              <w:t>36,400</w:t>
+              <w:t>43,640</w:t>
             </w:r>
           </w:p>
         </w:tc>
@@ -1273,7 +1281,7 @@
           </w:tcPr>
           <w:p>
             <w:r>
-              <w:t>$26,348</w:t>
+              <w:t>$27,389</w:t>
             </w:r>
           </w:p>
         </w:tc>
@@ -1283,7 +1291,7 @@
           </w:tcPr>
           <w:p>
             <w:r>
-              <w:t>Lee Johnson Mazda, Seattle, WA</w:t>
+              <w:t>Titus-Will, Olympia, WA</w:t>
             </w:r>
           </w:p>
         </w:tc>
@@ -1293,7 +1301,7 @@
           </w:tcPr>
           <w:p>
             <w:r>
-              <w:t>—</w:t>
+              <w:t>Good $389 over FPP</w:t>
             </w:r>
           </w:p>
         </w:tc>
@@ -1303,7 +1311,7 @@
           </w:tcPr>
           <w:p>
             <w:r>
-              <w:t>?-own / 0 · CPO</w:t>
+              <w:t>1-own / 0</w:t>
             </w:r>
           </w:p>
         </w:tc>
@@ -1313,7 +1321,7 @@
           </w:tcPr>
           <w:p>
             <w:r>
-              <w:t>None d</w:t>
+              <w:t>45 d</w:t>
             </w:r>
           </w:p>
         </w:tc>
@@ -1323,7 +1331,7 @@
           </w:tcPr>
           <w:p>
             <w:r>
-              <w:t>in the Lee Johnson two-car OTD request (Aug 11) — both emails to the dealer's listed sales address bounced back Aug 12 (server unreachable after 24h of retries) — the request never arrived; a new contact path is being arranged.</w:t>
+              <w:t>dealer asking to schedule a Saturday time (Aug 12 evening); paperwork requested first.</w:t>
             </w:r>
           </w:p>
         </w:tc>
@@ -1335,7 +1343,7 @@
           </w:tcPr>
           <w:p>
             <w:r>
-              <w:t>#13</w:t>
+              <w:t>#14</w:t>
             </w:r>
           </w:p>
         </w:tc>
@@ -1345,7 +1353,7 @@
           </w:tcPr>
           <w:p>
             <w:r>
-              <w:t>2022</w:t>
+              <w:t>2023</w:t>
             </w:r>
           </w:p>
         </w:tc>
@@ -1355,7 +1363,7 @@
           </w:tcPr>
           <w:p>
             <w:r>
-              <w:t>2.5 S Premium Plus</w:t>
+              <w:t>2.5 S Premium</w:t>
             </w:r>
           </w:p>
         </w:tc>
@@ -1365,7 +1373,7 @@
           </w:tcPr>
           <w:p>
             <w:r>
-              <w:t>43,640</w:t>
+              <w:t>17,505</w:t>
             </w:r>
           </w:p>
         </w:tc>
@@ -1375,7 +1383,7 @@
           </w:tcPr>
           <w:p>
             <w:r>
-              <w:t>$27,389</w:t>
+              <w:t>$28,287 + $200</w:t>
             </w:r>
           </w:p>
         </w:tc>
@@ -1385,7 +1393,7 @@
           </w:tcPr>
           <w:p>
             <w:r>
-              <w:t>Titus-Will, Olympia, WA</w:t>
+              <w:t>Rodland Toyota, Everett, WA</w:t>
             </w:r>
           </w:p>
         </w:tc>
@@ -1395,7 +1403,7 @@
           </w:tcPr>
           <w:p>
             <w:r>
-              <w:t>Good $389 over FPP</w:t>
+              <w:t>Good $873 below</w:t>
             </w:r>
           </w:p>
         </w:tc>
@@ -1415,7 +1423,7 @@
           </w:tcPr>
           <w:p>
             <w:r>
-              <w:t>45 d</w:t>
+              <w:t>29 d</w:t>
             </w:r>
           </w:p>
         </w:tc>
@@ -1425,7 +1433,7 @@
           </w:tcPr>
           <w:p>
             <w:r>
-              <w:t>dealer asking to schedule a Saturday time (Aug 12 evening); paperwork requested first.</w:t>
+              <w:t>dealer declined to negotiate by email (Aug 12 evening); no visit planned.</w:t>
             </w:r>
           </w:p>
         </w:tc>
@@ -1437,7 +1445,7 @@
           </w:tcPr>
           <w:p>
             <w:r>
-              <w:t>#14</w:t>
+              <w:t>#15</w:t>
             </w:r>
           </w:p>
         </w:tc>
@@ -1457,7 +1465,7 @@
           </w:tcPr>
           <w:p>
             <w:r>
-              <w:t>2.5 S Premium</w:t>
+              <w:t>2.5 S Premium · no-haggle</w:t>
             </w:r>
           </w:p>
         </w:tc>
@@ -1467,7 +1475,7 @@
           </w:tcPr>
           <w:p>
             <w:r>
-              <w:t>17,505</w:t>
+              <w:t>31,166</w:t>
             </w:r>
           </w:p>
         </w:tc>
@@ -1477,7 +1485,7 @@
           </w:tcPr>
           <w:p>
             <w:r>
-              <w:t>$28,287 + $200</w:t>
+              <w:t>$27,998 flat</w:t>
             </w:r>
           </w:p>
         </w:tc>
@@ -1487,7 +1495,7 @@
           </w:tcPr>
           <w:p>
             <w:r>
-              <w:t>Rodland Toyota, Everett, WA</w:t>
+              <w:t>CarMax, Renton, WA</w:t>
             </w:r>
           </w:p>
         </w:tc>
@@ -1497,7 +1505,7 @@
           </w:tcPr>
           <w:p>
             <w:r>
-              <w:t>Good $873 below</w:t>
+              <w:t>Fair $222 below</w:t>
             </w:r>
           </w:p>
         </w:tc>
@@ -1517,7 +1525,7 @@
           </w:tcPr>
           <w:p>
             <w:r>
-              <w:t>29 d</w:t>
+              <w:t>3 d</w:t>
             </w:r>
           </w:p>
         </w:tc>
@@ -1527,7 +1535,7 @@
           </w:tcPr>
           <w:p>
             <w:r>
-              <w:t>dealer declined to negotiate by email (Aug 12 evening); no visit planned.</w:t>
+              <w:t>reference car; nothing to request.</w:t>
             </w:r>
           </w:p>
         </w:tc>
@@ -1539,7 +1547,7 @@
           </w:tcPr>
           <w:p>
             <w:r>
-              <w:t>#15</w:t>
+              <w:t>#17</w:t>
             </w:r>
           </w:p>
         </w:tc>
@@ -1549,7 +1557,7 @@
           </w:tcPr>
           <w:p>
             <w:r>
-              <w:t>2023</w:t>
+              <w:t>2021</w:t>
             </w:r>
           </w:p>
         </w:tc>
@@ -1559,7 +1567,7 @@
           </w:tcPr>
           <w:p>
             <w:r>
-              <w:t>2.5 S Premium · no-haggle</w:t>
+              <w:t>Grand Touring w/ GT Premium pkg</w:t>
             </w:r>
           </w:p>
         </w:tc>
@@ -1569,7 +1577,7 @@
           </w:tcPr>
           <w:p>
             <w:r>
-              <w:t>31,166</w:t>
+              <w:t>30,066</w:t>
             </w:r>
           </w:p>
         </w:tc>
@@ -1579,7 +1587,7 @@
           </w:tcPr>
           <w:p>
             <w:r>
-              <w:t>$27,998 flat</w:t>
+              <w:t>$25,799</w:t>
             </w:r>
           </w:p>
         </w:tc>
@@ -1589,7 +1597,7 @@
           </w:tcPr>
           <w:p>
             <w:r>
-              <w:t>CarMax, Renton, WA</w:t>
+              <w:t>Auto 206, Kent, WA</w:t>
             </w:r>
           </w:p>
         </w:tc>
@@ -1599,7 +1607,7 @@
           </w:tcPr>
           <w:p>
             <w:r>
-              <w:t>Fair $222 below</w:t>
+              <w:t>— $3,281 &lt; FPP</w:t>
             </w:r>
           </w:p>
         </w:tc>
@@ -1609,7 +1617,7 @@
           </w:tcPr>
           <w:p>
             <w:r>
-              <w:t>1-own / 0</w:t>
+              <w:t>1-own / 1</w:t>
             </w:r>
           </w:p>
         </w:tc>
@@ -1619,7 +1627,7 @@
           </w:tcPr>
           <w:p>
             <w:r>
-              <w:t>3 d</w:t>
+              <w:t>5 d</w:t>
             </w:r>
           </w:p>
         </w:tc>
@@ -1629,7 +1637,7 @@
           </w:tcPr>
           <w:p>
             <w:r>
-              <w:t>reference car; nothing to request.</w:t>
+              <w:t>written offer in hand, valid to Aug 12, 7 PM; Carfax shows a 6/2024 accident. Discussion paused.</w:t>
             </w:r>
           </w:p>
         </w:tc>
@@ -1641,7 +1649,7 @@
           </w:tcPr>
           <w:p>
             <w:r>
-              <w:t>#17</w:t>
+              <w:t>#19</w:t>
             </w:r>
           </w:p>
         </w:tc>
@@ -1661,7 +1669,7 @@
           </w:tcPr>
           <w:p>
             <w:r>
-              <w:t>Grand Touring w/ GT Premium pkg</w:t>
+              <w:t>Signature (2.5T, ventilated)</w:t>
             </w:r>
           </w:p>
         </w:tc>
@@ -1671,7 +1679,7 @@
           </w:tcPr>
           <w:p>
             <w:r>
-              <w:t>30,066</w:t>
+              <w:t>40,451</w:t>
             </w:r>
           </w:p>
         </w:tc>
@@ -1681,7 +1689,7 @@
           </w:tcPr>
           <w:p>
             <w:r>
-              <w:t>$25,799</w:t>
+              <w:t>$26,712</w:t>
             </w:r>
           </w:p>
         </w:tc>
@@ -1691,7 +1699,7 @@
           </w:tcPr>
           <w:p>
             <w:r>
-              <w:t>Auto 206, Kent, WA</w:t>
+              <w:t>Tonkin Gresham Honda, Troutdale, OR</w:t>
             </w:r>
           </w:p>
         </w:tc>
@@ -1701,7 +1709,7 @@
           </w:tcPr>
           <w:p>
             <w:r>
-              <w:t>— $3,281 &lt; FPP</w:t>
+              <w:t>Good $700 below</w:t>
             </w:r>
           </w:p>
         </w:tc>
@@ -1711,7 +1719,7 @@
           </w:tcPr>
           <w:p>
             <w:r>
-              <w:t>1-own / 1</w:t>
+              <w:t>2-own / 0</w:t>
             </w:r>
           </w:p>
         </w:tc>
@@ -1721,7 +1729,7 @@
           </w:tcPr>
           <w:p>
             <w:r>
-              <w:t>5 d</w:t>
+              <w:t>18 d</w:t>
             </w:r>
           </w:p>
         </w:tc>
@@ -1731,7 +1739,7 @@
           </w:tcPr>
           <w:p>
             <w:r>
-              <w:t>written offer in hand, valid to Aug 12, 7 PM; Carfax shows a 6/2024 accident. Discussion paused.</w:t>
+              <w:t>not contacted; Oregon fallback, email-only.</w:t>
             </w:r>
           </w:p>
         </w:tc>
@@ -1743,7 +1751,7 @@
           </w:tcPr>
           <w:p>
             <w:r>
-              <w:t>#19</w:t>
+              <w:t>#20</w:t>
             </w:r>
           </w:p>
         </w:tc>
@@ -1753,7 +1761,7 @@
           </w:tcPr>
           <w:p>
             <w:r>
-              <w:t>2021</w:t>
+              <w:t>2023</w:t>
             </w:r>
           </w:p>
         </w:tc>
@@ -1763,7 +1771,7 @@
           </w:tcPr>
           <w:p>
             <w:r>
-              <w:t>Signature (2.5T, ventilated)</w:t>
+              <w:t>2.5 S Preferred</w:t>
             </w:r>
           </w:p>
         </w:tc>
@@ -1773,7 +1781,7 @@
           </w:tcPr>
           <w:p>
             <w:r>
-              <w:t>40,451</w:t>
+              <w:t>16,969</w:t>
             </w:r>
           </w:p>
         </w:tc>
@@ -1783,7 +1791,7 @@
           </w:tcPr>
           <w:p>
             <w:r>
-              <w:t>$26,712</w:t>
+              <w:t>$26,500</w:t>
             </w:r>
           </w:p>
         </w:tc>
@@ -1793,7 +1801,7 @@
           </w:tcPr>
           <w:p>
             <w:r>
-              <w:t>Tonkin Gresham Honda, Troutdale, OR</w:t>
+              <w:t>Royal Moore Mazda, Hillsboro, OR</w:t>
             </w:r>
           </w:p>
         </w:tc>
@@ -1803,7 +1811,7 @@
           </w:tcPr>
           <w:p>
             <w:r>
-              <w:t>Good $700 below</w:t>
+              <w:t>—</w:t>
             </w:r>
           </w:p>
         </w:tc>
@@ -1813,7 +1821,7 @@
           </w:tcPr>
           <w:p>
             <w:r>
-              <w:t>2-own / 0</w:t>
+              <w:t>?-own / 0</w:t>
             </w:r>
           </w:p>
         </w:tc>
@@ -1833,109 +1841,7 @@
           </w:tcPr>
           <w:p>
             <w:r>
-              <w:t>not contacted; Oregon fallback, email-only.</w:t>
-            </w:r>
-          </w:p>
-        </w:tc>
-      </w:tr>
-      <w:tr>
-        <w:tc>
-          <w:tcPr>
-            <w:tcW w:type="dxa" w:w="864"/>
-          </w:tcPr>
-          <w:p>
-            <w:r>
-              <w:t>#20</w:t>
-            </w:r>
-          </w:p>
-        </w:tc>
-        <w:tc>
-          <w:tcPr>
-            <w:tcW w:type="dxa" w:w="864"/>
-          </w:tcPr>
-          <w:p>
-            <w:r>
-              <w:t>2023</w:t>
-            </w:r>
-          </w:p>
-        </w:tc>
-        <w:tc>
-          <w:tcPr>
-            <w:tcW w:type="dxa" w:w="864"/>
-          </w:tcPr>
-          <w:p>
-            <w:r>
-              <w:t>2.5 S Preferred</w:t>
-            </w:r>
-          </w:p>
-        </w:tc>
-        <w:tc>
-          <w:tcPr>
-            <w:tcW w:type="dxa" w:w="864"/>
-          </w:tcPr>
-          <w:p>
-            <w:r>
-              <w:t>16,969</w:t>
-            </w:r>
-          </w:p>
-        </w:tc>
-        <w:tc>
-          <w:tcPr>
-            <w:tcW w:type="dxa" w:w="864"/>
-          </w:tcPr>
-          <w:p>
-            <w:r>
-              <w:t>$26,500</w:t>
-            </w:r>
-          </w:p>
-        </w:tc>
-        <w:tc>
-          <w:tcPr>
-            <w:tcW w:type="dxa" w:w="864"/>
-          </w:tcPr>
-          <w:p>
-            <w:r>
-              <w:t>Royal Moore Mazda, Hillsboro, OR</w:t>
-            </w:r>
-          </w:p>
-        </w:tc>
-        <w:tc>
-          <w:tcPr>
-            <w:tcW w:type="dxa" w:w="864"/>
-          </w:tcPr>
-          <w:p>
-            <w:r>
-              <w:t>—</w:t>
-            </w:r>
-          </w:p>
-        </w:tc>
-        <w:tc>
-          <w:tcPr>
-            <w:tcW w:type="dxa" w:w="864"/>
-          </w:tcPr>
-          <w:p>
-            <w:r>
-              <w:t>?-own / 0</w:t>
-            </w:r>
-          </w:p>
-        </w:tc>
-        <w:tc>
-          <w:tcPr>
-            <w:tcW w:type="dxa" w:w="864"/>
-          </w:tcPr>
-          <w:p>
-            <w:r>
-              <w:t>18 d</w:t>
-            </w:r>
-          </w:p>
-        </w:tc>
-        <w:tc>
-          <w:tcPr>
-            <w:tcW w:type="dxa" w:w="864"/>
-          </w:tcPr>
-          <w:p>
-            <w:r>
-              <w:t>folded into the #8 thread; no separate quote yet. Oregon: email-only.</w:t>
+              <w:t>dealer requoted their remaining 2023 Preferred (stock p12315) Thu Aug 13 with the dealer-added items removed.</w:t>
             </w:r>
           </w:p>
         </w:tc>
@@ -2046,7 +1952,7 @@
     <w:p/>
     <w:p>
       <w:r>
-        <w:t>Removed as sold: #2 Acura of Seattle 2022 2.5 Turbo AWD (Aug 11), #3 BMW Seattle 2021 Grand Touring Reserve (2.5T) (Aug 11), #11 CarMax Sacramento 2022 Carbon Edition (Aug 11), #16 Doug's Lynnwood Mazda 2021 Grand Touring AWD (Aug 11), #18 Auto Connections of Bellevue 2023 2.5 S Preferred (Aug 11).</w:t>
+        <w:t>Removed as sold: #2 Acura of Seattle 2022 2.5 Turbo AWD (Aug 11), #3 BMW Seattle 2021 Grand Touring Reserve (2.5T) (Aug 11), #8 Royal Moore Mazda 2023 2.5 S Preferred (Aug 13), #11 CarMax Sacramento 2022 Carbon Edition (Aug 11), #16 Doug's Lynnwood Mazda 2021 Grand Touring AWD (Aug 11), #18 Auto Connections of Bellevue 2023 2.5 S Preferred (Aug 11).</w:t>
       </w:r>
     </w:p>
     <w:p>
@@ -3944,7 +3850,7 @@
           </w:tcPr>
           <w:p>
             <w:r>
-              <w:t>11</w:t>
+              <w:t>10</w:t>
             </w:r>
           </w:p>
         </w:tc>
@@ -5012,88 +4918,6 @@
           <w:p>
             <w:r>
               <w:t>$5,098</w:t>
-            </w:r>
-          </w:p>
-        </w:tc>
-      </w:tr>
-      <w:tr>
-        <w:tc>
-          <w:tcPr>
-            <w:tcW w:type="dxa" w:w="1080"/>
-          </w:tcPr>
-          <w:p>
-            <w:r>
-              <w:t>#8</w:t>
-            </w:r>
-          </w:p>
-        </w:tc>
-        <w:tc>
-          <w:tcPr>
-            <w:tcW w:type="dxa" w:w="1080"/>
-          </w:tcPr>
-          <w:p>
-            <w:r>
-              <w:t>2023 2.5 S Preferred · Royal Moore Mazda</w:t>
-            </w:r>
-          </w:p>
-        </w:tc>
-        <w:tc>
-          <w:tcPr>
-            <w:tcW w:type="dxa" w:w="1080"/>
-          </w:tcPr>
-          <w:p>
-            <w:r>
-              <w:t>est. 11.05%</w:t>
-            </w:r>
-          </w:p>
-        </w:tc>
-        <w:tc>
-          <w:tcPr>
-            <w:tcW w:type="dxa" w:w="1080"/>
-          </w:tcPr>
-          <w:p>
-            <w:r>
-              <w:t>$26,900</w:t>
-            </w:r>
-          </w:p>
-        </w:tc>
-        <w:tc>
-          <w:tcPr>
-            <w:tcW w:type="dxa" w:w="1080"/>
-          </w:tcPr>
-          <w:p>
-            <w:r>
-              <w:t>$30,472</w:t>
-            </w:r>
-          </w:p>
-        </w:tc>
-        <w:tc>
-          <w:tcPr>
-            <w:tcW w:type="dxa" w:w="1080"/>
-          </w:tcPr>
-          <w:p>
-            <w:r>
-              <w:t>$593</w:t>
-            </w:r>
-          </w:p>
-        </w:tc>
-        <w:tc>
-          <w:tcPr>
-            <w:tcW w:type="dxa" w:w="1080"/>
-          </w:tcPr>
-          <w:p>
-            <w:r>
-              <w:t>$496</w:t>
-            </w:r>
-          </w:p>
-        </w:tc>
-        <w:tc>
-          <w:tcPr>
-            <w:tcW w:type="dxa" w:w="1080"/>
-          </w:tcPr>
-          <w:p>
-            <w:r>
-              <w:t>$5,130</w:t>
             </w:r>
           </w:p>
         </w:tc>
@@ -6299,6 +6123,58 @@
           <w:p>
             <w:r>
               <w:t>dealer confirmed Aug 11 PM; CarGurus copy closed Aug 12</w:t>
+            </w:r>
+          </w:p>
+        </w:tc>
+      </w:tr>
+      <w:tr>
+        <w:tc>
+          <w:tcPr>
+            <w:tcW w:type="dxa" w:w="1728"/>
+          </w:tcPr>
+          <w:p>
+            <w:r>
+              <w:t>#8</w:t>
+            </w:r>
+          </w:p>
+        </w:tc>
+        <w:tc>
+          <w:tcPr>
+            <w:tcW w:type="dxa" w:w="1728"/>
+          </w:tcPr>
+          <w:p>
+            <w:r>
+              <w:t>2023 2.5 S Preferred AWD</w:t>
+            </w:r>
+          </w:p>
+        </w:tc>
+        <w:tc>
+          <w:tcPr>
+            <w:tcW w:type="dxa" w:w="1728"/>
+          </w:tcPr>
+          <w:p>
+            <w:r>
+              <w:t>Royal Moore Mazda</w:t>
+            </w:r>
+          </w:p>
+        </w:tc>
+        <w:tc>
+          <w:tcPr>
+            <w:tcW w:type="dxa" w:w="1728"/>
+          </w:tcPr>
+          <w:p>
+            <w:r>
+              <w:t>$26,900</w:t>
+            </w:r>
+          </w:p>
+        </w:tc>
+        <w:tc>
+          <w:tcPr>
+            <w:tcW w:type="dxa" w:w="1728"/>
+          </w:tcPr>
+          <w:p>
+            <w:r>
+              <w:t>dealer email Aug 13</w:t>
             </w:r>
           </w:p>
         </w:tc>

</xml_diff>

<commit_message>
Board: Titus-Will confirmed their best number and is off the weekend visit list
Co-Authored-By: Claude Fable 5 <noreply@anthropic.com>
Claude-Session: https://claude.ai/code/session_01HSSGkNu3Mr9vQrXnxF1MKw
</commit_message>
<xml_diff>
--- a/cx5_report.docx
+++ b/cx5_report.docx
@@ -17,7 +17,7 @@
     </w:p>
     <w:p>
       <w:r>
-        <w:t>Published Aug 7, 2026 · refreshed Aug 13, 2026: 15 cars in play, 6 sold, 6 written quotes in hand. This document, the web page, the status board and the Excel workbook are generated together from one board file; listings change daily, so verify before contacting.</w:t>
+        <w:t>Published Aug 7, 2026 · refreshed Aug 14, 2026: 15 cars in play, 6 sold, 6 written quotes in hand. This document, the web page, the status board and the Excel workbook are generated together from one board file; listings change daily, so verify before contacting.</w:t>
       </w:r>
     </w:p>
     <w:p>
@@ -33,7 +33,7 @@
         <w:pStyle w:val="ListBullet"/>
       </w:pPr>
       <w:r>
-        <w:t>Update Aug 13: Royal Moore: one 2023 Preferred sold per the dealer; the remaining one was requoted with the dealer-added items removed.</w:t>
+        <w:t>Update Aug 14: Titus-Will: dealer confirmed their best number and stood down; the Olympia car is off the weekend visit list.</w:t>
       </w:r>
     </w:p>
     <w:p>
@@ -66,6 +66,14 @@
       </w:pPr>
       <w:r>
         <w:t>What changed</w:t>
+      </w:r>
+    </w:p>
+    <w:p>
+      <w:pPr>
+        <w:pStyle w:val="ListBullet"/>
+      </w:pPr>
+      <w:r>
+        <w:t>Aug 14, 2026: Titus-Will: dealer confirmed their best number and stood down; the Olympia car is off the weekend visit list.</w:t>
       </w:r>
     </w:p>
     <w:p>
@@ -193,7 +201,7 @@
         <w:pStyle w:val="Heading1"/>
       </w:pPr>
       <w:r>
-        <w:t>Top 3 right now (Aug 13)</w:t>
+        <w:t>Top 3 right now (Aug 14)</w:t>
       </w:r>
     </w:p>
     <w:p>
@@ -244,7 +252,7 @@
     </w:p>
     <w:p>
       <w:r>
-        <w:t>Biggest FPP gap in the entire dataset ($2,781 under), 1-owner, 89 days on lot → strongest negotiating leverage. Dealer's own site shows $27,999; still no written OTD as of Aug 13 (form lead + phone promise Aug 11).</w:t>
+        <w:t>Biggest FPP gap in the entire dataset ($2,781 under), 1-owner, 89 days on lot → strongest negotiating leverage. Dealer's own site shows $27,999; still no written OTD as of Aug 14 (form lead + phone promise Aug 11).</w:t>
       </w:r>
     </w:p>
     <w:p>
@@ -1331,7 +1339,7 @@
           </w:tcPr>
           <w:p>
             <w:r>
-              <w:t>dealer asking to schedule a Saturday time (Aug 12 evening); paperwork requested first.</w:t>
+              <w:t>dealer confirmed their best number Fri Aug 14 and left the door open; not on this weekend's visit list.</w:t>
             </w:r>
           </w:p>
         </w:tc>
@@ -1970,7 +1978,7 @@
     </w:p>
     <w:p>
       <w:r>
-        <w:t>Not numbered board cars and not in the top picks, cost table or chart; re-priced on each sweep (prices as of Aug 13).</w:t>
+        <w:t>Not numbered board cars and not in the top picks, cost table or chart; re-priced on each sweep (prices as of Aug 14).</w:t>
       </w:r>
     </w:p>
     <w:p>
@@ -2026,7 +2034,7 @@
           </w:tcPr>
           <w:p>
             <w:r>
-              <w:t>Price Aug 13</w:t>
+              <w:t>Price Aug 14</w:t>
             </w:r>
           </w:p>
         </w:tc>
@@ -2966,7 +2974,7 @@
           </w:tcPr>
           <w:p>
             <w:r>
-              <w:t>Lowest clean listing (Aug 13)</w:t>
+              <w:t>Lowest clean listing (Aug 14)</w:t>
             </w:r>
           </w:p>
         </w:tc>
@@ -7052,7 +7060,7 @@
     </w:p>
     <w:p>
       <w:r>
-        <w:t>Research compiled Aug 7, 2026 as a read-only scan; buyer outreach to dealers began Aug 11 and listings were last re-checked Aug 13, 2026. Not affiliated with any seller. Verify history reports and pricing independently before purchase.</w:t>
+        <w:t>Research compiled Aug 7, 2026 as a read-only scan; buyer outreach to dealers began Aug 11 and listings were last re-checked Aug 14, 2026. Not affiliated with any seller. Verify history reports and pricing independently before purchase.</w:t>
       </w:r>
     </w:p>
     <w:sectPr>

</xml_diff>

<commit_message>
Board: certified 2023 Carbon worksheet received; quote recorded
Co-Authored-By: Claude Fable 5 <noreply@anthropic.com>
Claude-Session: https://claude.ai/code/session_01HSSGkNu3Mr9vQrXnxF1MKw
</commit_message>
<xml_diff>
--- a/cx5_report.docx
+++ b/cx5_report.docx
@@ -17,7 +17,7 @@
     </w:p>
     <w:p>
       <w:r>
-        <w:t>Published Aug 7, 2026 · refreshed Aug 14, 2026: 15 cars in play, 6 sold, 6 written quotes in hand. This document, the web page, the status board and the Excel workbook are generated together from one board file; listings change daily, so verify before contacting.</w:t>
+        <w:t>Published Aug 7, 2026 · refreshed Aug 14, 2026: 15 cars in play, 6 sold, 7 written quotes in hand. This document, the web page, the status board and the Excel workbook are generated together from one board file; listings change daily, so verify before contacting.</w:t>
       </w:r>
     </w:p>
     <w:p>
@@ -33,7 +33,7 @@
         <w:pStyle w:val="ListBullet"/>
       </w:pPr>
       <w:r>
-        <w:t>Update Aug 14: Titus-Will: dealer confirmed their best number and stood down; the Olympia car is off the weekend visit list.</w:t>
+        <w:t>Update Aug 14: Puyallup Mazda: itemized worksheet received for the certified 2023 Carbon (#9); zero add-ons.</w:t>
       </w:r>
     </w:p>
     <w:p>
@@ -66,6 +66,14 @@
       </w:pPr>
       <w:r>
         <w:t>What changed</w:t>
+      </w:r>
+    </w:p>
+    <w:p>
+      <w:pPr>
+        <w:pStyle w:val="ListBullet"/>
+      </w:pPr>
+      <w:r>
+        <w:t>Aug 14, 2026: Puyallup Mazda: itemized worksheet received for the certified 2023 Carbon (#9); zero add-ons.</w:t>
       </w:r>
     </w:p>
     <w:p>
@@ -1033,7 +1041,7 @@
           </w:tcPr>
           <w:p>
             <w:r>
-              <w:t>CPO pricing breakdown received Thu Aug 13 early afternoon; itemized worksheet attached in the dealer's email.</w:t>
+              <w:t>itemized written worksheet received Fri Aug 14; zero add-ons and the selling price came in under the advertised figure.</w:t>
             </w:r>
           </w:p>
         </w:tc>

</xml_diff>

<commit_message>
Correct car #5: the CARFAX shows an accident reported 7/31/2021
The full report, pulled by Hyundai of Kirkland on 8/11 and read today,
records an accident on 7/31/2021 with no airbag deployment. The car was
carried here as accident-free on the strength of a CarGurus badge. Also
captures the one-owner Washington history, 12 Doug's Lynnwood service
records, the 6/9/2026 lot date and the expired factory warranty.

Co-Authored-By: Claude Opus 5 <noreply@anthropic.com>
Claude-Session: https://claude.ai/code/session_01HSSGkNu3Mr9vQrXnxF1MKw
</commit_message>
<xml_diff>
--- a/cx5_report.docx
+++ b/cx5_report.docx
@@ -49,7 +49,7 @@
         <w:pStyle w:val="ListBullet"/>
       </w:pPr>
       <w:r>
-        <w:t>Cheapest solid vs. stretch: #5 2021 Grand Touring AWD at $28,713 OTD (est, $559/mo) vs. #1 2023 2.5 Turbo AWD at $31,823 (est, $620/mo).</w:t>
+        <w:t>Cheapest solid vs. stretch: #4 2021 Carbon Edition Turbo at $29,559 OTD (est, $576/mo) vs. #1 2023 2.5 Turbo AWD at $31,823 (est, $620/mo).</w:t>
       </w:r>
     </w:p>
     <w:p>
@@ -222,7 +222,7 @@
     </w:p>
     <w:p>
       <w:r>
-        <w:t>33,336 mi · Hyundai of Kirkland / Ford of Kirkland · Kirkland, WA · Good $3,338 &lt; FPP · 1 owner · 0 accidents</w:t>
+        <w:t>33,336 mi · Hyundai of Kirkland / Ford of Kirkland · Kirkland, WA · Good $3,338 &lt; FPP · 1 owner · 1 accident</w:t>
       </w:r>
     </w:p>
     <w:p>
@@ -715,7 +715,7 @@
           </w:tcPr>
           <w:p>
             <w:r>
-              <w:t>1-own / 0</w:t>
+              <w:t>1-own / 1</w:t>
             </w:r>
           </w:p>
         </w:tc>
@@ -735,7 +735,7 @@
           </w:tcPr>
           <w:p>
             <w:r>
-              <w:t>updated written proposal received Thu Aug 13 midday; license billed at actuals with any overage refunded and two keys confirmed in writing; window sticker being pulled to confirm the GT Premium package; replied Thu afternoon.</w:t>
+              <w:t>CARFAX read in full Sat Aug 15: one owner, Washington only, 12 dealer service records and no open recalls, but an accident reported 7/31/2021 with no severity, no impact location and no repair record. Previously carried here as accident-free, which was wrong.</w:t>
             </w:r>
           </w:p>
         </w:tc>
@@ -3146,7 +3146,7 @@
           </w:tcPr>
           <w:p>
             <w:r>
-              <w:t>9</w:t>
+              <w:t>8</w:t>
             </w:r>
           </w:p>
         </w:tc>
@@ -5618,7 +5618,7 @@
           </w:tcPr>
           <w:p>
             <w:r>
-              <w:t>#5 2021 Grand Touring AWD · Hyundai of Kirkland</w:t>
+              <w:t>#4 2021 Carbon Edition Turbo · Ron Tonkin Honda</w:t>
             </w:r>
           </w:p>
         </w:tc>
@@ -5628,7 +5628,7 @@
           </w:tcPr>
           <w:p>
             <w:r>
-              <w:t>$25,192</w:t>
+              <w:t>$25,852</w:t>
             </w:r>
           </w:p>
         </w:tc>
@@ -5638,7 +5638,7 @@
           </w:tcPr>
           <w:p>
             <w:r>
-              <w:t>$28,713 (est)</w:t>
+              <w:t>$29,559 (est)</w:t>
             </w:r>
           </w:p>
         </w:tc>
@@ -5648,7 +5648,7 @@
           </w:tcPr>
           <w:p>
             <w:r>
-              <w:t>$559</w:t>
+              <w:t>$576</w:t>
             </w:r>
           </w:p>
         </w:tc>
@@ -5658,7 +5658,7 @@
           </w:tcPr>
           <w:p>
             <w:r>
-              <w:t>$462</w:t>
+              <w:t>$478</w:t>
             </w:r>
           </w:p>
         </w:tc>
@@ -5750,7 +5750,7 @@
           </w:tcPr>
           <w:p>
             <w:r>
-              <w:t>+$2,807</w:t>
+              <w:t>+$2,147</w:t>
             </w:r>
           </w:p>
         </w:tc>
@@ -5760,7 +5760,7 @@
           </w:tcPr>
           <w:p>
             <w:r>
-              <w:t>+$3,110</w:t>
+              <w:t>+$2,264</w:t>
             </w:r>
           </w:p>
         </w:tc>
@@ -5770,7 +5770,7 @@
           </w:tcPr>
           <w:p>
             <w:r>
-              <w:t>+$61/mo</w:t>
+              <w:t>+$44/mo</w:t>
             </w:r>
           </w:p>
         </w:tc>
@@ -5780,7 +5780,7 @@
           </w:tcPr>
           <w:p>
             <w:r>
-              <w:t>+$61/mo</w:t>
+              <w:t>+$44/mo</w:t>
             </w:r>
           </w:p>
         </w:tc>
@@ -5794,7 +5794,7 @@
     </w:p>
     <w:p>
       <w:r>
-        <w:t>Worked example, #5 2021 Grand Touring AWD: $25,192 price → $28,713 out-the-door → $559/mo at $0 down, or $462/mo with $5,000 down (6.30% APR, 60 mo).</w:t>
+        <w:t>Worked example, #4 2021 Carbon Edition Turbo: $25,852 price → $29,559 out-the-door → $576/mo at $0 down, or $478/mo with $5,000 down (6.30% APR, 60 mo).</w:t>
       </w:r>
     </w:p>
     <w:p>

</xml_diff>

<commit_message>
Ingest the Puyallup lot evidence: stickers, CARFAXes and lower posted prices
The 2023 Turbo's original Monroney confirms the full comfort package
including ventilated seats, and its CARFAX shows one owner, a personal
lease and no accidents. The red 2021 is a Canadian-market car with a
Saskatchewan safety-inspection failure recorded 8/15/2025 and no repair
record after it, so it comes off consideration. The certified 2023's
CARFAX link would not load, so its history stays marked unverified.
All three posted prices have come down.

Co-Authored-By: Claude Opus 5 <noreply@anthropic.com>
Claude-Session: https://claude.ai/code/session_01HSSGkNu3Mr9vQrXnxF1MKw
</commit_message>
<xml_diff>
--- a/cx5_report.docx
+++ b/cx5_report.docx
@@ -49,7 +49,7 @@
         <w:pStyle w:val="ListBullet"/>
       </w:pPr>
       <w:r>
-        <w:t>Cheapest solid vs. stretch: #4 2021 Carbon Edition Turbo at $29,559 OTD (est, $576/mo) vs. #1 2023 2.5 Turbo AWD at $31,823 (est, $620/mo).</w:t>
+        <w:t>Cheapest solid vs. stretch: #4 2021 Carbon Edition Turbo at $29,559 OTD (est, $576/mo) vs. #1 2023 2.5 Turbo AWD at $31,513 (est, $614/mo).</w:t>
       </w:r>
     </w:p>
     <w:p>
@@ -245,7 +245,7 @@
         <w:pStyle w:val="Heading2"/>
       </w:pPr>
       <w:r>
-        <w:t>#1 · Stretch pick · 2023 2.5 Turbo AWD — $28,199</w:t>
+        <w:t>#1 · Stretch pick · 2023 2.5 Turbo AWD — $27,919</w:t>
       </w:r>
     </w:p>
     <w:p>
@@ -255,7 +255,7 @@
     </w:p>
     <w:p>
       <w:r>
-        <w:t>$620/mo at $0 down on the estimated OTD of $31,823 (6.30% · 60 mo).</w:t>
+        <w:t>$614/mo at $0 down on the estimated OTD of $31,513 (6.30% · 60 mo).</w:t>
       </w:r>
     </w:p>
     <w:p>
@@ -481,7 +481,7 @@
           </w:tcPr>
           <w:p>
             <w:r>
-              <w:t>$28,199</w:t>
+              <w:t>$27,919</w:t>
             </w:r>
           </w:p>
         </w:tc>
@@ -531,7 +531,7 @@
           </w:tcPr>
           <w:p>
             <w:r>
-              <w:t>written itemized quote in hand (sheet dated Aug 11, surfaced Aug 12 after a phone call; the sender's group domain had gone to spam); zero add-ons.</w:t>
+              <w:t>Seen and driven Sat Aug 15. The original window sticker confirms the full comfort package including ventilated front seats, and the CARFAX shows one owner, a personal lease and no accidents.</w:t>
             </w:r>
           </w:p>
         </w:tc>
@@ -787,7 +787,7 @@
           </w:tcPr>
           <w:p>
             <w:r>
-              <w:t>$25,198</w:t>
+              <w:t>$24,948</w:t>
             </w:r>
           </w:p>
         </w:tc>
@@ -817,7 +817,7 @@
           </w:tcPr>
           <w:p>
             <w:r>
-              <w:t>2-own / 0</w:t>
+              <w:t>3-own / 0</w:t>
             </w:r>
           </w:p>
         </w:tc>
@@ -837,7 +837,7 @@
           </w:tcPr>
           <w:p>
             <w:r>
-              <w:t>written itemized quote in hand (sheet dated Aug 11, surfaced Aug 12); zero add-ons.</w:t>
+              <w:t>CARFAX read in full Sat Aug 15. A Canadian-market car with a Saskatchewan safety-inspection failure recorded 8/15/2025 and no repair record after it, imported to the United States in May 2026 and sold at auction in June. Removed from consideration.</w:t>
             </w:r>
           </w:p>
         </w:tc>
@@ -991,7 +991,7 @@
           </w:tcPr>
           <w:p>
             <w:r>
-              <w:t>$27,699</w:t>
+              <w:t>$27,424</w:t>
             </w:r>
           </w:p>
         </w:tc>
@@ -1041,7 +1041,7 @@
           </w:tcPr>
           <w:p>
             <w:r>
-              <w:t>itemized written worksheet received Fri Aug 14; zero add-ons and the selling price came in under the advertised figure.</w:t>
+              <w:t>Seen Sat Aug 15. The dealer CARFAX link for this vehicle would not load, so its history remains unverified.</w:t>
             </w:r>
           </w:p>
         </w:tc>
@@ -3270,7 +3270,7 @@
           </w:tcPr>
           <w:p>
             <w:r>
-              <w:t>$25,198 (#6)</w:t>
+              <w:t>$24,948 (#6)</w:t>
             </w:r>
           </w:p>
         </w:tc>
@@ -3280,7 +3280,7 @@
           </w:tcPr>
           <w:p>
             <w:r>
-              <w:t>+$3,498²</w:t>
+              <w:t>+$3,248²</w:t>
             </w:r>
           </w:p>
         </w:tc>
@@ -4134,7 +4134,7 @@
           </w:tcPr>
           <w:p>
             <w:r>
-              <w:t>$28,199 (#1)</w:t>
+              <w:t>$27,919 (#1)</w:t>
             </w:r>
           </w:p>
         </w:tc>
@@ -4144,7 +4144,7 @@
           </w:tcPr>
           <w:p>
             <w:r>
-              <w:t>−$2,781</w:t>
+              <w:t>−$3,061</w:t>
             </w:r>
           </w:p>
         </w:tc>
@@ -4401,7 +4401,7 @@
           </w:tcPr>
           <w:p>
             <w:r>
-              <w:t>$24,998</w:t>
+              <w:t>$24,748</w:t>
             </w:r>
           </w:p>
         </w:tc>
@@ -4411,7 +4411,7 @@
           </w:tcPr>
           <w:p>
             <w:r>
-              <w:t>$28,498</w:t>
+              <w:t>$28,221</w:t>
             </w:r>
           </w:p>
         </w:tc>
@@ -4421,7 +4421,7 @@
           </w:tcPr>
           <w:p>
             <w:r>
-              <w:t>$555</w:t>
+              <w:t>$550</w:t>
             </w:r>
           </w:p>
         </w:tc>
@@ -4431,7 +4431,7 @@
           </w:tcPr>
           <w:p>
             <w:r>
-              <w:t>$458</w:t>
+              <w:t>$452</w:t>
             </w:r>
           </w:p>
         </w:tc>
@@ -4441,7 +4441,7 @@
           </w:tcPr>
           <w:p>
             <w:r>
-              <w:t>$4,798</w:t>
+              <w:t>$4,751</w:t>
             </w:r>
           </w:p>
         </w:tc>
@@ -5027,7 +5027,7 @@
           </w:tcPr>
           <w:p>
             <w:r>
-              <w:t>#13</w:t>
+              <w:t>#9</w:t>
             </w:r>
           </w:p>
         </w:tc>
@@ -5037,7 +5037,7 @@
           </w:tcPr>
           <w:p>
             <w:r>
-              <w:t>2022 2.5 S Premium Plus · Titus-Will</w:t>
+              <w:t>2023 2.5 S Carbon Edition · Puyallup Mazda</w:t>
             </w:r>
           </w:p>
         </w:tc>
@@ -5047,7 +5047,7 @@
           </w:tcPr>
           <w:p>
             <w:r>
-              <w:t>est. 10.20%</w:t>
+              <w:t>est. 10.80%</w:t>
             </w:r>
           </w:p>
         </w:tc>
@@ -5057,7 +5057,7 @@
           </w:tcPr>
           <w:p>
             <w:r>
-              <w:t>$27,389</w:t>
+              <w:t>$27,224</w:t>
             </w:r>
           </w:p>
         </w:tc>
@@ -5067,7 +5067,7 @@
           </w:tcPr>
           <w:p>
             <w:r>
-              <w:t>$30,983</w:t>
+              <w:t>$30,964</w:t>
             </w:r>
           </w:p>
         </w:tc>
@@ -5097,7 +5097,7 @@
           </w:tcPr>
           <w:p>
             <w:r>
-              <w:t>$5,216</w:t>
+              <w:t>$5,213</w:t>
             </w:r>
           </w:p>
         </w:tc>
@@ -5109,7 +5109,7 @@
           </w:tcPr>
           <w:p>
             <w:r>
-              <w:t>#9</w:t>
+              <w:t>#13</w:t>
             </w:r>
           </w:p>
         </w:tc>
@@ -5119,7 +5119,7 @@
           </w:tcPr>
           <w:p>
             <w:r>
-              <w:t>2023 2.5 S Carbon Edition · Puyallup Mazda</w:t>
+              <w:t>2022 2.5 S Premium Plus · Titus-Will</w:t>
             </w:r>
           </w:p>
         </w:tc>
@@ -5129,7 +5129,7 @@
           </w:tcPr>
           <w:p>
             <w:r>
-              <w:t>est. 10.80%</w:t>
+              <w:t>est. 10.20%</w:t>
             </w:r>
           </w:p>
         </w:tc>
@@ -5139,7 +5139,7 @@
           </w:tcPr>
           <w:p>
             <w:r>
-              <w:t>$27,499</w:t>
+              <w:t>$27,389</w:t>
             </w:r>
           </w:p>
         </w:tc>
@@ -5149,7 +5149,7 @@
           </w:tcPr>
           <w:p>
             <w:r>
-              <w:t>$31,269</w:t>
+              <w:t>$30,983</w:t>
             </w:r>
           </w:p>
         </w:tc>
@@ -5159,7 +5159,7 @@
           </w:tcPr>
           <w:p>
             <w:r>
-              <w:t>$609</w:t>
+              <w:t>$603</w:t>
             </w:r>
           </w:p>
         </w:tc>
@@ -5169,7 +5169,7 @@
           </w:tcPr>
           <w:p>
             <w:r>
-              <w:t>$512</w:t>
+              <w:t>$506</w:t>
             </w:r>
           </w:p>
         </w:tc>
@@ -5179,7 +5179,7 @@
           </w:tcPr>
           <w:p>
             <w:r>
-              <w:t>$5,264</w:t>
+              <w:t>$5,216</w:t>
             </w:r>
           </w:p>
         </w:tc>
@@ -5303,7 +5303,7 @@
           </w:tcPr>
           <w:p>
             <w:r>
-              <w:t>$27,999</w:t>
+              <w:t>$27,719</w:t>
             </w:r>
           </w:p>
         </w:tc>
@@ -5313,7 +5313,7 @@
           </w:tcPr>
           <w:p>
             <w:r>
-              <w:t>$31,823</w:t>
+              <w:t>$31,513</w:t>
             </w:r>
           </w:p>
         </w:tc>
@@ -5323,7 +5323,7 @@
           </w:tcPr>
           <w:p>
             <w:r>
-              <w:t>$620</w:t>
+              <w:t>$614</w:t>
             </w:r>
           </w:p>
         </w:tc>
@@ -5333,7 +5333,7 @@
           </w:tcPr>
           <w:p>
             <w:r>
-              <w:t>$522</w:t>
+              <w:t>$516</w:t>
             </w:r>
           </w:p>
         </w:tc>
@@ -5343,7 +5343,7 @@
           </w:tcPr>
           <w:p>
             <w:r>
-              <w:t>$5,358</w:t>
+              <w:t>$5,305</w:t>
             </w:r>
           </w:p>
         </w:tc>
@@ -5690,7 +5690,7 @@
           </w:tcPr>
           <w:p>
             <w:r>
-              <w:t>$27,999</w:t>
+              <w:t>$27,719</w:t>
             </w:r>
           </w:p>
         </w:tc>
@@ -5700,7 +5700,7 @@
           </w:tcPr>
           <w:p>
             <w:r>
-              <w:t>$31,823 (est)</w:t>
+              <w:t>$31,513 (est)</w:t>
             </w:r>
           </w:p>
         </w:tc>
@@ -5710,7 +5710,7 @@
           </w:tcPr>
           <w:p>
             <w:r>
-              <w:t>$620</w:t>
+              <w:t>$614</w:t>
             </w:r>
           </w:p>
         </w:tc>
@@ -5720,7 +5720,7 @@
           </w:tcPr>
           <w:p>
             <w:r>
-              <w:t>$522</w:t>
+              <w:t>$516</w:t>
             </w:r>
           </w:p>
         </w:tc>
@@ -5750,7 +5750,7 @@
           </w:tcPr>
           <w:p>
             <w:r>
-              <w:t>+$2,147</w:t>
+              <w:t>+$1,867</w:t>
             </w:r>
           </w:p>
         </w:tc>
@@ -5760,7 +5760,7 @@
           </w:tcPr>
           <w:p>
             <w:r>
-              <w:t>+$2,264</w:t>
+              <w:t>+$1,954</w:t>
             </w:r>
           </w:p>
         </w:tc>
@@ -5770,7 +5770,7 @@
           </w:tcPr>
           <w:p>
             <w:r>
-              <w:t>+$44/mo</w:t>
+              <w:t>+$38/mo</w:t>
             </w:r>
           </w:p>
         </w:tc>
@@ -5780,7 +5780,7 @@
           </w:tcPr>
           <w:p>
             <w:r>
-              <w:t>+$44/mo</w:t>
+              <w:t>+$38/mo</w:t>
             </w:r>
           </w:p>
         </w:tc>

</xml_diff>

<commit_message>
Close the search: the 2023 Turbo was purchased Aug 15
Marks VIN JM3KFBAY3P0289626 purchased, freezes the board as of that
date, and adds the closing changelog entry. Figures stay off the public
pages as always.

Co-Authored-By: Claude Opus 5 <noreply@anthropic.com>
Claude-Session: https://claude.ai/code/session_01HSSGkNu3Mr9vQrXnxF1MKw
</commit_message>
<xml_diff>
--- a/cx5_report.docx
+++ b/cx5_report.docx
@@ -17,7 +17,7 @@
     </w:p>
     <w:p>
       <w:r>
-        <w:t>Published Aug 7, 2026 · refreshed Aug 14, 2026: 15 cars in play, 6 sold, 7 written quotes in hand. This document, the web page, the status board and the Excel workbook are generated together from one board file; listings change daily, so verify before contacting.</w:t>
+        <w:t>Published Aug 7, 2026 · refreshed Aug 14, 2026: 14 cars in play, 7 sold, 6 written quotes in hand. This document, the web page, the status board and the Excel workbook are generated together from one board file; listings change daily, so verify before contacting.</w:t>
       </w:r>
     </w:p>
     <w:p>
@@ -33,7 +33,7 @@
         <w:pStyle w:val="ListBullet"/>
       </w:pPr>
       <w:r>
-        <w:t>Update Aug 14: Puyallup Mazda: itemized worksheet received for the certified 2023 Carbon (#9); zero add-ons.</w:t>
+        <w:t>Update Aug 14: Search closed. The buyer purchased the 2023 CX-5 2.5 Turbo AWD (VIN JM3KFBAY3P0289626, 27,990 miles) from Puyallup Mazda on Aug 15 2026.</w:t>
       </w:r>
     </w:p>
     <w:p>
@@ -49,7 +49,7 @@
         <w:pStyle w:val="ListBullet"/>
       </w:pPr>
       <w:r>
-        <w:t>Cheapest solid vs. stretch: #4 2021 Carbon Edition Turbo at $29,559 OTD (est, $576/mo) vs. #1 2023 2.5 Turbo AWD at $31,513 (est, $614/mo).</w:t>
+        <w:t>Cheapest solid vs. stretch: #4 2021 Carbon Edition Turbo at $29,559 OTD (est, $576/mo) vs. #14 2023 2.5 S Premium at $32,029 (est, $624/mo).</w:t>
       </w:r>
     </w:p>
     <w:p>
@@ -66,6 +66,38 @@
       </w:pPr>
       <w:r>
         <w:t>What changed</w:t>
+      </w:r>
+    </w:p>
+    <w:p>
+      <w:pPr>
+        <w:pStyle w:val="ListBullet"/>
+      </w:pPr>
+      <w:r>
+        <w:t>Aug 15, 2026: Search closed. The buyer purchased the 2023 CX-5 2.5 Turbo AWD (VIN JM3KFBAY3P0289626, 27,990 miles) from Puyallup Mazda on Aug 15 2026.</w:t>
+      </w:r>
+    </w:p>
+    <w:p>
+      <w:pPr>
+        <w:pStyle w:val="ListBullet"/>
+      </w:pPr>
+      <w:r>
+        <w:t>Aug 15, 2026: The board is frozen as of that date. Prices, availability and history notes on the remaining cars reflect the last verification before close and are no longer being maintained.</w:t>
+      </w:r>
+    </w:p>
+    <w:p>
+      <w:pPr>
+        <w:pStyle w:val="ListBullet"/>
+      </w:pPr>
+      <w:r>
+        <w:t>Aug 15, 2026: Verified in person that day: the 2023 Turbo's original window sticker (full comfort package standard on the 25T trim) and a clean one-owner CARFAX.</w:t>
+      </w:r>
+    </w:p>
+    <w:p>
+      <w:pPr>
+        <w:pStyle w:val="ListBullet"/>
+      </w:pPr>
+      <w:r>
+        <w:t>Aug 15, 2026: Removed from consideration: Puyallup's red 2021, a Canadian-market car whose CARFAX records a Saskatchewan safety-inspection failure on 8/15/2025 with no repair record after it.</w:t>
       </w:r>
     </w:p>
     <w:p>
@@ -245,34 +277,6 @@
         <w:pStyle w:val="Heading2"/>
       </w:pPr>
       <w:r>
-        <w:t>#1 · Stretch pick · 2023 2.5 Turbo AWD — $27,919</w:t>
-      </w:r>
-    </w:p>
-    <w:p>
-      <w:r>
-        <w:t>27,990 mi · Puyallup Mazda · Puyallup, WA · Great $2,781 &lt; FPP · 1 owner · 0 accidents</w:t>
-      </w:r>
-    </w:p>
-    <w:p>
-      <w:r>
-        <w:t>$614/mo at $0 down on the estimated OTD of $31,513 (6.30% · 60 mo).</w:t>
-      </w:r>
-    </w:p>
-    <w:p>
-      <w:r>
-        <w:t>Biggest FPP gap in the entire dataset ($2,781 under), 1-owner, 89 days on lot → strongest negotiating leverage. Dealer's own site shows $27,999; still no written OTD as of Aug 14 (form lead + phone promise Aug 11).</w:t>
-      </w:r>
-    </w:p>
-    <w:p>
-      <w:r>
-        <w:t>https://www.cargurus.com/Cars/listing/448185375</w:t>
-      </w:r>
-    </w:p>
-    <w:p>
-      <w:pPr>
-        <w:pStyle w:val="Heading2"/>
-      </w:pPr>
-      <w:r>
         <w:t>#7 · Only in-Seattle CPO · 2022 2.5 S Carbon Edition — $27,512</w:t>
       </w:r>
     </w:p>
@@ -297,6 +301,30 @@
       </w:r>
     </w:p>
     <w:p>
+      <w:pPr>
+        <w:pStyle w:val="Heading2"/>
+      </w:pPr>
+      <w:r>
+        <w:t>#6 · By value · 2021 Carbon Ed Turbo AWD — $24,948</w:t>
+      </w:r>
+    </w:p>
+    <w:p>
+      <w:r>
+        <w:t>42,515 mi · Puyallup Mazda · Puyallup, WA · Great $1,939 below · 3 owners · 0 accidents</w:t>
+      </w:r>
+    </w:p>
+    <w:p>
+      <w:r>
+        <w:t>$550/mo at $0 down on the estimated OTD of $28,221 (6.30% · 60 mo).</w:t>
+      </w:r>
+    </w:p>
+    <w:p/>
+    <w:p>
+      <w:r>
+        <w:t>https://www.cargurus.com/Cars/listing/449972241</w:t>
+      </w:r>
+    </w:p>
+    <w:p>
       <w:r>
         <w:t>Runners-up, comfort-first: #12, the Mazda-CPO 2023 Preferred at Lee Johnson ($26,348, in the same written request as #7), and #13, the ventilated-seat 2022 Premium Plus in Olympia (revised written quote in hand); #4, the dealer-confirmed Carbon Turbo in Portland ($26,102, quote in preparation), is the Oregon fallback (email only).</w:t>
       </w:r>
@@ -306,7 +334,7 @@
         <w:pStyle w:val="Heading1"/>
       </w:pPr>
       <w:r>
-        <w:t>Shortlist and new candidates: 15 cars in play</w:t>
+        <w:t>Shortlist and new candidates: 14 cars in play</w:t>
       </w:r>
     </w:p>
     <w:p>
@@ -441,108 +469,6 @@
           </w:tcPr>
           <w:p>
             <w:r>
-              <w:t>#1</w:t>
-            </w:r>
-          </w:p>
-        </w:tc>
-        <w:tc>
-          <w:tcPr>
-            <w:tcW w:type="dxa" w:w="864"/>
-          </w:tcPr>
-          <w:p>
-            <w:r>
-              <w:t>2023</w:t>
-            </w:r>
-          </w:p>
-        </w:tc>
-        <w:tc>
-          <w:tcPr>
-            <w:tcW w:type="dxa" w:w="864"/>
-          </w:tcPr>
-          <w:p>
-            <w:r>
-              <w:t>2.5 Turbo AWD</w:t>
-            </w:r>
-          </w:p>
-        </w:tc>
-        <w:tc>
-          <w:tcPr>
-            <w:tcW w:type="dxa" w:w="864"/>
-          </w:tcPr>
-          <w:p>
-            <w:r>
-              <w:t>27,990</w:t>
-            </w:r>
-          </w:p>
-        </w:tc>
-        <w:tc>
-          <w:tcPr>
-            <w:tcW w:type="dxa" w:w="864"/>
-          </w:tcPr>
-          <w:p>
-            <w:r>
-              <w:t>$27,919</w:t>
-            </w:r>
-          </w:p>
-        </w:tc>
-        <w:tc>
-          <w:tcPr>
-            <w:tcW w:type="dxa" w:w="864"/>
-          </w:tcPr>
-          <w:p>
-            <w:r>
-              <w:t>Puyallup Mazda, Puyallup, WA</w:t>
-            </w:r>
-          </w:p>
-        </w:tc>
-        <w:tc>
-          <w:tcPr>
-            <w:tcW w:type="dxa" w:w="864"/>
-          </w:tcPr>
-          <w:p>
-            <w:r>
-              <w:t>Great $2,781 &lt; FPP</w:t>
-            </w:r>
-          </w:p>
-        </w:tc>
-        <w:tc>
-          <w:tcPr>
-            <w:tcW w:type="dxa" w:w="864"/>
-          </w:tcPr>
-          <w:p>
-            <w:r>
-              <w:t>1-own / 0</w:t>
-            </w:r>
-          </w:p>
-        </w:tc>
-        <w:tc>
-          <w:tcPr>
-            <w:tcW w:type="dxa" w:w="864"/>
-          </w:tcPr>
-          <w:p>
-            <w:r>
-              <w:t>89 d</w:t>
-            </w:r>
-          </w:p>
-        </w:tc>
-        <w:tc>
-          <w:tcPr>
-            <w:tcW w:type="dxa" w:w="864"/>
-          </w:tcPr>
-          <w:p>
-            <w:r>
-              <w:t>Seen and driven Sat Aug 15. The original window sticker confirms the full comfort package including ventilated front seats, and the CARFAX shows one owner, a personal lease and no accidents.</w:t>
-            </w:r>
-          </w:p>
-        </w:tc>
-      </w:tr>
-      <w:tr>
-        <w:tc>
-          <w:tcPr>
-            <w:tcW w:type="dxa" w:w="864"/>
-          </w:tcPr>
-          <w:p>
-            <w:r>
               <w:t>#4</w:t>
             </w:r>
           </w:p>
@@ -1968,7 +1894,7 @@
     <w:p/>
     <w:p>
       <w:r>
-        <w:t>Removed as sold: #2 Acura of Seattle 2022 2.5 Turbo AWD (Aug 11), #3 BMW Seattle 2021 Grand Touring Reserve (2.5T) (Aug 11), #8 Royal Moore Mazda 2023 2.5 S Preferred (Aug 13), #11 CarMax Sacramento 2022 Carbon Edition (Aug 11), #16 Doug's Lynnwood Mazda 2021 Grand Touring AWD (Aug 11), #18 Auto Connections of Bellevue 2023 2.5 S Preferred (Aug 11).</w:t>
+        <w:t>Removed as sold: #1 Puyallup Mazda 2023 2.5 Turbo AWD (Aug 15), #2 Acura of Seattle 2022 2.5 Turbo AWD (Aug 11), #3 BMW Seattle 2021 Grand Touring Reserve (2.5T) (Aug 11), #8 Royal Moore Mazda 2023 2.5 S Preferred (Aug 13), #11 CarMax Sacramento 2022 Carbon Edition (Aug 11), #16 Doug's Lynnwood Mazda 2021 Grand Touring AWD (Aug 11), #18 Auto Connections of Bellevue 2023 2.5 S Preferred (Aug 11).</w:t>
       </w:r>
     </w:p>
     <w:p>
@@ -4134,7 +4060,7 @@
           </w:tcPr>
           <w:p>
             <w:r>
-              <w:t>$27,919 (#1)</w:t>
+              <w:t>$28,998 (CarGurus)</w:t>
             </w:r>
           </w:p>
         </w:tc>
@@ -4144,7 +4070,7 @@
           </w:tcPr>
           <w:p>
             <w:r>
-              <w:t>−$3,061</w:t>
+              <w:t>−$1,982</w:t>
             </w:r>
           </w:p>
         </w:tc>
@@ -4154,7 +4080,7 @@
           </w:tcPr>
           <w:p>
             <w:r>
-              <w:t>2</w:t>
+              <w:t>1</w:t>
             </w:r>
           </w:p>
         </w:tc>
@@ -5273,88 +5199,6 @@
           </w:tcPr>
           <w:p>
             <w:r>
-              <w:t>#1</w:t>
-            </w:r>
-          </w:p>
-        </w:tc>
-        <w:tc>
-          <w:tcPr>
-            <w:tcW w:type="dxa" w:w="1080"/>
-          </w:tcPr>
-          <w:p>
-            <w:r>
-              <w:t>2023 2.5 Turbo AWD · Puyallup Mazda</w:t>
-            </w:r>
-          </w:p>
-        </w:tc>
-        <w:tc>
-          <w:tcPr>
-            <w:tcW w:type="dxa" w:w="1080"/>
-          </w:tcPr>
-          <w:p>
-            <w:r>
-              <w:t>est. 10.80%</w:t>
-            </w:r>
-          </w:p>
-        </w:tc>
-        <w:tc>
-          <w:tcPr>
-            <w:tcW w:type="dxa" w:w="1080"/>
-          </w:tcPr>
-          <w:p>
-            <w:r>
-              <w:t>$27,719</w:t>
-            </w:r>
-          </w:p>
-        </w:tc>
-        <w:tc>
-          <w:tcPr>
-            <w:tcW w:type="dxa" w:w="1080"/>
-          </w:tcPr>
-          <w:p>
-            <w:r>
-              <w:t>$31,513</w:t>
-            </w:r>
-          </w:p>
-        </w:tc>
-        <w:tc>
-          <w:tcPr>
-            <w:tcW w:type="dxa" w:w="1080"/>
-          </w:tcPr>
-          <w:p>
-            <w:r>
-              <w:t>$614</w:t>
-            </w:r>
-          </w:p>
-        </w:tc>
-        <w:tc>
-          <w:tcPr>
-            <w:tcW w:type="dxa" w:w="1080"/>
-          </w:tcPr>
-          <w:p>
-            <w:r>
-              <w:t>$516</w:t>
-            </w:r>
-          </w:p>
-        </w:tc>
-        <w:tc>
-          <w:tcPr>
-            <w:tcW w:type="dxa" w:w="1080"/>
-          </w:tcPr>
-          <w:p>
-            <w:r>
-              <w:t>$5,305</w:t>
-            </w:r>
-          </w:p>
-        </w:tc>
-      </w:tr>
-      <w:tr>
-        <w:tc>
-          <w:tcPr>
-            <w:tcW w:type="dxa" w:w="1080"/>
-          </w:tcPr>
-          <w:p>
-            <w:r>
               <w:t>#15</w:t>
             </w:r>
           </w:p>
@@ -5680,7 +5524,7 @@
           </w:tcPr>
           <w:p>
             <w:r>
-              <w:t>#1 2023 2.5 Turbo AWD · Puyallup Mazda</w:t>
+              <w:t>#14 2023 2.5 S Premium · Rodland Toyota</w:t>
             </w:r>
           </w:p>
         </w:tc>
@@ -5690,7 +5534,7 @@
           </w:tcPr>
           <w:p>
             <w:r>
-              <w:t>$27,719</w:t>
+              <w:t>$28,287</w:t>
             </w:r>
           </w:p>
         </w:tc>
@@ -5700,7 +5544,7 @@
           </w:tcPr>
           <w:p>
             <w:r>
-              <w:t>$31,513 (est)</w:t>
+              <w:t>$32,029 (est)</w:t>
             </w:r>
           </w:p>
         </w:tc>
@@ -5710,7 +5554,7 @@
           </w:tcPr>
           <w:p>
             <w:r>
-              <w:t>$614</w:t>
+              <w:t>$624</w:t>
             </w:r>
           </w:p>
         </w:tc>
@@ -5720,7 +5564,7 @@
           </w:tcPr>
           <w:p>
             <w:r>
-              <w:t>$516</w:t>
+              <w:t>$526</w:t>
             </w:r>
           </w:p>
         </w:tc>
@@ -5750,7 +5594,7 @@
           </w:tcPr>
           <w:p>
             <w:r>
-              <w:t>+$1,867</w:t>
+              <w:t>+$2,435</w:t>
             </w:r>
           </w:p>
         </w:tc>
@@ -5760,7 +5604,7 @@
           </w:tcPr>
           <w:p>
             <w:r>
-              <w:t>+$1,954</w:t>
+              <w:t>+$2,470</w:t>
             </w:r>
           </w:p>
         </w:tc>
@@ -5770,7 +5614,7 @@
           </w:tcPr>
           <w:p>
             <w:r>
-              <w:t>+$38/mo</w:t>
+              <w:t>+$48/mo</w:t>
             </w:r>
           </w:p>
         </w:tc>
@@ -5780,7 +5624,7 @@
           </w:tcPr>
           <w:p>
             <w:r>
-              <w:t>+$38/mo</w:t>
+              <w:t>+$48/mo</w:t>
             </w:r>
           </w:p>
         </w:tc>
@@ -6035,6 +5879,58 @@
           <w:p>
             <w:r>
               <w:t>Sold</w:t>
+            </w:r>
+          </w:p>
+        </w:tc>
+      </w:tr>
+      <w:tr>
+        <w:tc>
+          <w:tcPr>
+            <w:tcW w:type="dxa" w:w="1728"/>
+          </w:tcPr>
+          <w:p>
+            <w:r>
+              <w:t>#1</w:t>
+            </w:r>
+          </w:p>
+        </w:tc>
+        <w:tc>
+          <w:tcPr>
+            <w:tcW w:type="dxa" w:w="1728"/>
+          </w:tcPr>
+          <w:p>
+            <w:r>
+              <w:t>2023 2.5 Turbo AWD</w:t>
+            </w:r>
+          </w:p>
+        </w:tc>
+        <w:tc>
+          <w:tcPr>
+            <w:tcW w:type="dxa" w:w="1728"/>
+          </w:tcPr>
+          <w:p>
+            <w:r>
+              <w:t>Puyallup Mazda</w:t>
+            </w:r>
+          </w:p>
+        </w:tc>
+        <w:tc>
+          <w:tcPr>
+            <w:tcW w:type="dxa" w:w="1728"/>
+          </w:tcPr>
+          <w:p>
+            <w:r>
+              <w:t>$27,919</w:t>
+            </w:r>
+          </w:p>
+        </w:tc>
+        <w:tc>
+          <w:tcPr>
+            <w:tcW w:type="dxa" w:w="1728"/>
+          </w:tcPr>
+          <w:p>
+            <w:r>
+              <w:t>purchased by the buyer this report was built for</w:t>
             </w:r>
           </w:p>
         </w:tc>

</xml_diff>